<commit_message>
actualizacion de archivos, etc
</commit_message>
<xml_diff>
--- a/docs/analisis-diseno/plan-casos-de-uso-por-hito.docx
+++ b/docs/analisis-diseno/plan-casos-de-uso-por-hito.docx
@@ -743,6 +743,68 @@
     </w:p>
     <w:p>
       <w:pPr>
+        <w:spacing w:after="140" w:line="276"/>
+      </w:pPr>
+      <w:r>
+        <w:rPr>
+          <w:b/>
+          <w:bCs/>
+        </w:rPr>
+        <w:t xml:space="preserve">Dos reglas que los niveles nunca cambian:</w:t>
+      </w:r>
+    </w:p>
+    <w:p>
+      <w:pPr>
+        <w:pStyle w:val="ListParagraph"/>
+        <w:numPr>
+          <w:ilvl w:val="0"/>
+          <w:numId w:val="2"/>
+        </w:numPr>
+        <w:spacing w:after="80" w:line="276"/>
+      </w:pPr>
+      <w:r>
+        <w:rPr>
+          <w:b/>
+          <w:bCs/>
+        </w:rPr>
+        <w:t xml:space="preserve">Las condiciones explícitas de cada RF se cumplen siempre</w:t>
+      </w:r>
+      <w:r>
+        <w:t xml:space="preserve">, sea cual sea el nivel. Por ejemplo, la importación es idempotente (RF 7) aunque sea mínima, y el cuadro tarifario contempla recargos y bonificaciones (RF 3). Lo que un nivel menor recorta son validaciones adicionales, terminación de la interfaz y casos borde.</w:t>
+      </w:r>
+    </w:p>
+    <w:p>
+      <w:pPr>
+        <w:pStyle w:val="ListParagraph"/>
+        <w:numPr>
+          <w:ilvl w:val="0"/>
+          <w:numId w:val="2"/>
+        </w:numPr>
+        <w:spacing w:after="80" w:line="276"/>
+      </w:pPr>
+      <w:r>
+        <w:rPr>
+          <w:b/>
+          <w:bCs/>
+        </w:rPr>
+        <w:t xml:space="preserve">Los requerimientos opcionales se implementan completos o no se implementan.</w:t>
+      </w:r>
+      <w:r>
+        <w:t xml:space="preserve"> La letra (sección 7) establece que </w:t>
+      </w:r>
+      <w:r>
+        <w:rPr>
+          <w:i/>
+          <w:iCs/>
+        </w:rPr>
+        <w:t xml:space="preserve">"un requerimiento implementado parcialmente no otorga puntos parciales: se evalúa contra las condiciones indicadas en cada caso"</w:t>
+      </w:r>
+      <w:r>
+        <w:t xml:space="preserve">. Por eso los casos de un opcional son siempre de nivel Completo (sección 4).</w:t>
+      </w:r>
+    </w:p>
+    <w:p>
+      <w:pPr>
         <w:pStyle w:val="Heading2"/>
       </w:pPr>
       <w:r>
@@ -769,7 +831,7 @@
         <w:pStyle w:val="ListParagraph"/>
         <w:numPr>
           <w:ilvl w:val="0"/>
-          <w:numId w:val="2"/>
+          <w:numId w:val="3"/>
         </w:numPr>
         <w:spacing w:after="80" w:line="276"/>
       </w:pPr>
@@ -782,7 +844,7 @@
         <w:pStyle w:val="ListParagraph"/>
         <w:numPr>
           <w:ilvl w:val="0"/>
-          <w:numId w:val="2"/>
+          <w:numId w:val="3"/>
         </w:numPr>
         <w:spacing w:after="80" w:line="276"/>
       </w:pPr>
@@ -795,7 +857,7 @@
         <w:pStyle w:val="ListParagraph"/>
         <w:numPr>
           <w:ilvl w:val="0"/>
-          <w:numId w:val="2"/>
+          <w:numId w:val="3"/>
         </w:numPr>
         <w:spacing w:after="80" w:line="276"/>
       </w:pPr>
@@ -1544,7 +1606,7 @@
                 <w:sz w:val="20"/>
                 <w:szCs w:val="20"/>
               </w:rPr>
-              <w:t xml:space="preserve">5</w:t>
+              <w:t xml:space="preserve">9</w:t>
             </w:r>
           </w:p>
         </w:tc>
@@ -5416,11 +5478,11 @@
         </w:tblBorders>
       </w:tblPr>
       <w:tblGrid>
-        <w:gridCol w:w="1045"/>
-        <w:gridCol w:w="2913"/>
-        <w:gridCol w:w="1045"/>
-        <w:gridCol w:w="1290"/>
-        <w:gridCol w:w="3013"/>
+        <w:gridCol w:w="1032"/>
+        <w:gridCol w:w="2821"/>
+        <w:gridCol w:w="1032"/>
+        <w:gridCol w:w="1267"/>
+        <w:gridCol w:w="3154"/>
       </w:tblGrid>
       <w:tr>
         <w:trPr>
@@ -5428,7 +5490,7 @@
         </w:trPr>
         <w:tc>
           <w:tcPr>
-            <w:tcW w:type="dxa" w:w="1045"/>
+            <w:tcW w:type="dxa" w:w="1032"/>
             <w:tcBorders>
               <w:top w:val="single" w:color="BFBFBF" w:sz="4"/>
               <w:left w:val="single" w:color="BFBFBF" w:sz="4"/>
@@ -5457,7 +5519,7 @@
         </w:tc>
         <w:tc>
           <w:tcPr>
-            <w:tcW w:type="dxa" w:w="2913"/>
+            <w:tcW w:type="dxa" w:w="2821"/>
             <w:tcBorders>
               <w:top w:val="single" w:color="BFBFBF" w:sz="4"/>
               <w:left w:val="single" w:color="BFBFBF" w:sz="4"/>
@@ -5486,7 +5548,7 @@
         </w:tc>
         <w:tc>
           <w:tcPr>
-            <w:tcW w:type="dxa" w:w="1045"/>
+            <w:tcW w:type="dxa" w:w="1032"/>
             <w:tcBorders>
               <w:top w:val="single" w:color="BFBFBF" w:sz="4"/>
               <w:left w:val="single" w:color="BFBFBF" w:sz="4"/>
@@ -5515,7 +5577,7 @@
         </w:tc>
         <w:tc>
           <w:tcPr>
-            <w:tcW w:type="dxa" w:w="1290"/>
+            <w:tcW w:type="dxa" w:w="1267"/>
             <w:tcBorders>
               <w:top w:val="single" w:color="BFBFBF" w:sz="4"/>
               <w:left w:val="single" w:color="BFBFBF" w:sz="4"/>
@@ -5544,7 +5606,7 @@
         </w:tc>
         <w:tc>
           <w:tcPr>
-            <w:tcW w:type="dxa" w:w="3013"/>
+            <w:tcW w:type="dxa" w:w="3154"/>
             <w:tcBorders>
               <w:top w:val="single" w:color="BFBFBF" w:sz="4"/>
               <w:left w:val="single" w:color="BFBFBF" w:sz="4"/>
@@ -5575,7 +5637,7 @@
       <w:tr>
         <w:tc>
           <w:tcPr>
-            <w:tcW w:type="dxa" w:w="1045"/>
+            <w:tcW w:type="dxa" w:w="1032"/>
             <w:tcBorders>
               <w:top w:val="single" w:color="BFBFBF" w:sz="4"/>
               <w:left w:val="single" w:color="BFBFBF" w:sz="4"/>
@@ -5601,7 +5663,7 @@
         </w:tc>
         <w:tc>
           <w:tcPr>
-            <w:tcW w:type="dxa" w:w="2913"/>
+            <w:tcW w:type="dxa" w:w="2821"/>
             <w:tcBorders>
               <w:top w:val="single" w:color="BFBFBF" w:sz="4"/>
               <w:left w:val="single" w:color="BFBFBF" w:sz="4"/>
@@ -5627,7 +5689,7 @@
         </w:tc>
         <w:tc>
           <w:tcPr>
-            <w:tcW w:type="dxa" w:w="1045"/>
+            <w:tcW w:type="dxa" w:w="1032"/>
             <w:tcBorders>
               <w:top w:val="single" w:color="BFBFBF" w:sz="4"/>
               <w:left w:val="single" w:color="BFBFBF" w:sz="4"/>
@@ -5653,7 +5715,7 @@
         </w:tc>
         <w:tc>
           <w:tcPr>
-            <w:tcW w:type="dxa" w:w="1290"/>
+            <w:tcW w:type="dxa" w:w="1267"/>
             <w:tcBorders>
               <w:top w:val="single" w:color="BFBFBF" w:sz="4"/>
               <w:left w:val="single" w:color="BFBFBF" w:sz="4"/>
@@ -5679,7 +5741,7 @@
         </w:tc>
         <w:tc>
           <w:tcPr>
-            <w:tcW w:type="dxa" w:w="3013"/>
+            <w:tcW w:type="dxa" w:w="3154"/>
             <w:tcBorders>
               <w:top w:val="single" w:color="BFBFBF" w:sz="4"/>
               <w:left w:val="single" w:color="BFBFBF" w:sz="4"/>
@@ -5707,7 +5769,7 @@
       <w:tr>
         <w:tc>
           <w:tcPr>
-            <w:tcW w:type="dxa" w:w="1045"/>
+            <w:tcW w:type="dxa" w:w="1032"/>
             <w:tcBorders>
               <w:top w:val="single" w:color="BFBFBF" w:sz="4"/>
               <w:left w:val="single" w:color="BFBFBF" w:sz="4"/>
@@ -5733,7 +5795,7 @@
         </w:tc>
         <w:tc>
           <w:tcPr>
-            <w:tcW w:type="dxa" w:w="2913"/>
+            <w:tcW w:type="dxa" w:w="2821"/>
             <w:tcBorders>
               <w:top w:val="single" w:color="BFBFBF" w:sz="4"/>
               <w:left w:val="single" w:color="BFBFBF" w:sz="4"/>
@@ -5759,7 +5821,7 @@
         </w:tc>
         <w:tc>
           <w:tcPr>
-            <w:tcW w:type="dxa" w:w="1045"/>
+            <w:tcW w:type="dxa" w:w="1032"/>
             <w:tcBorders>
               <w:top w:val="single" w:color="BFBFBF" w:sz="4"/>
               <w:left w:val="single" w:color="BFBFBF" w:sz="4"/>
@@ -5785,7 +5847,7 @@
         </w:tc>
         <w:tc>
           <w:tcPr>
-            <w:tcW w:type="dxa" w:w="1290"/>
+            <w:tcW w:type="dxa" w:w="1267"/>
             <w:tcBorders>
               <w:top w:val="single" w:color="BFBFBF" w:sz="4"/>
               <w:left w:val="single" w:color="BFBFBF" w:sz="4"/>
@@ -5811,7 +5873,7 @@
         </w:tc>
         <w:tc>
           <w:tcPr>
-            <w:tcW w:type="dxa" w:w="3013"/>
+            <w:tcW w:type="dxa" w:w="3154"/>
             <w:tcBorders>
               <w:top w:val="single" w:color="BFBFBF" w:sz="4"/>
               <w:left w:val="single" w:color="BFBFBF" w:sz="4"/>
@@ -5831,7 +5893,7 @@
       <w:tr>
         <w:tc>
           <w:tcPr>
-            <w:tcW w:type="dxa" w:w="1045"/>
+            <w:tcW w:type="dxa" w:w="1032"/>
             <w:tcBorders>
               <w:top w:val="single" w:color="BFBFBF" w:sz="4"/>
               <w:left w:val="single" w:color="BFBFBF" w:sz="4"/>
@@ -5857,7 +5919,7 @@
         </w:tc>
         <w:tc>
           <w:tcPr>
-            <w:tcW w:type="dxa" w:w="2913"/>
+            <w:tcW w:type="dxa" w:w="2821"/>
             <w:tcBorders>
               <w:top w:val="single" w:color="BFBFBF" w:sz="4"/>
               <w:left w:val="single" w:color="BFBFBF" w:sz="4"/>
@@ -5883,7 +5945,7 @@
         </w:tc>
         <w:tc>
           <w:tcPr>
-            <w:tcW w:type="dxa" w:w="1045"/>
+            <w:tcW w:type="dxa" w:w="1032"/>
             <w:tcBorders>
               <w:top w:val="single" w:color="BFBFBF" w:sz="4"/>
               <w:left w:val="single" w:color="BFBFBF" w:sz="4"/>
@@ -5909,7 +5971,7 @@
         </w:tc>
         <w:tc>
           <w:tcPr>
-            <w:tcW w:type="dxa" w:w="1290"/>
+            <w:tcW w:type="dxa" w:w="1267"/>
             <w:tcBorders>
               <w:top w:val="single" w:color="BFBFBF" w:sz="4"/>
               <w:left w:val="single" w:color="BFBFBF" w:sz="4"/>
@@ -5935,7 +5997,7 @@
         </w:tc>
         <w:tc>
           <w:tcPr>
-            <w:tcW w:type="dxa" w:w="3013"/>
+            <w:tcW w:type="dxa" w:w="3154"/>
             <w:tcBorders>
               <w:top w:val="single" w:color="BFBFBF" w:sz="4"/>
               <w:left w:val="single" w:color="BFBFBF" w:sz="4"/>
@@ -5963,7 +6025,7 @@
       <w:tr>
         <w:tc>
           <w:tcPr>
-            <w:tcW w:type="dxa" w:w="1045"/>
+            <w:tcW w:type="dxa" w:w="1032"/>
             <w:tcBorders>
               <w:top w:val="single" w:color="BFBFBF" w:sz="4"/>
               <w:left w:val="single" w:color="BFBFBF" w:sz="4"/>
@@ -5989,7 +6051,7 @@
         </w:tc>
         <w:tc>
           <w:tcPr>
-            <w:tcW w:type="dxa" w:w="2913"/>
+            <w:tcW w:type="dxa" w:w="2821"/>
             <w:tcBorders>
               <w:top w:val="single" w:color="BFBFBF" w:sz="4"/>
               <w:left w:val="single" w:color="BFBFBF" w:sz="4"/>
@@ -6015,7 +6077,7 @@
         </w:tc>
         <w:tc>
           <w:tcPr>
-            <w:tcW w:type="dxa" w:w="1045"/>
+            <w:tcW w:type="dxa" w:w="1032"/>
             <w:tcBorders>
               <w:top w:val="single" w:color="BFBFBF" w:sz="4"/>
               <w:left w:val="single" w:color="BFBFBF" w:sz="4"/>
@@ -6041,7 +6103,7 @@
         </w:tc>
         <w:tc>
           <w:tcPr>
-            <w:tcW w:type="dxa" w:w="1290"/>
+            <w:tcW w:type="dxa" w:w="1267"/>
             <w:tcBorders>
               <w:top w:val="single" w:color="BFBFBF" w:sz="4"/>
               <w:left w:val="single" w:color="BFBFBF" w:sz="4"/>
@@ -6067,7 +6129,7 @@
         </w:tc>
         <w:tc>
           <w:tcPr>
-            <w:tcW w:type="dxa" w:w="3013"/>
+            <w:tcW w:type="dxa" w:w="3154"/>
             <w:tcBorders>
               <w:top w:val="single" w:color="BFBFBF" w:sz="4"/>
               <w:left w:val="single" w:color="BFBFBF" w:sz="4"/>
@@ -6087,7 +6149,7 @@
       <w:tr>
         <w:tc>
           <w:tcPr>
-            <w:tcW w:type="dxa" w:w="1045"/>
+            <w:tcW w:type="dxa" w:w="1032"/>
             <w:tcBorders>
               <w:top w:val="single" w:color="BFBFBF" w:sz="4"/>
               <w:left w:val="single" w:color="BFBFBF" w:sz="4"/>
@@ -6113,7 +6175,7 @@
         </w:tc>
         <w:tc>
           <w:tcPr>
-            <w:tcW w:type="dxa" w:w="2913"/>
+            <w:tcW w:type="dxa" w:w="2821"/>
             <w:tcBorders>
               <w:top w:val="single" w:color="BFBFBF" w:sz="4"/>
               <w:left w:val="single" w:color="BFBFBF" w:sz="4"/>
@@ -6139,7 +6201,7 @@
         </w:tc>
         <w:tc>
           <w:tcPr>
-            <w:tcW w:type="dxa" w:w="1045"/>
+            <w:tcW w:type="dxa" w:w="1032"/>
             <w:tcBorders>
               <w:top w:val="single" w:color="BFBFBF" w:sz="4"/>
               <w:left w:val="single" w:color="BFBFBF" w:sz="4"/>
@@ -6165,7 +6227,7 @@
         </w:tc>
         <w:tc>
           <w:tcPr>
-            <w:tcW w:type="dxa" w:w="1290"/>
+            <w:tcW w:type="dxa" w:w="1267"/>
             <w:tcBorders>
               <w:top w:val="single" w:color="BFBFBF" w:sz="4"/>
               <w:left w:val="single" w:color="BFBFBF" w:sz="4"/>
@@ -6191,7 +6253,7 @@
         </w:tc>
         <w:tc>
           <w:tcPr>
-            <w:tcW w:type="dxa" w:w="3013"/>
+            <w:tcW w:type="dxa" w:w="3154"/>
             <w:tcBorders>
               <w:top w:val="single" w:color="BFBFBF" w:sz="4"/>
               <w:left w:val="single" w:color="BFBFBF" w:sz="4"/>
@@ -6219,7 +6281,7 @@
       <w:tr>
         <w:tc>
           <w:tcPr>
-            <w:tcW w:type="dxa" w:w="1045"/>
+            <w:tcW w:type="dxa" w:w="1032"/>
             <w:tcBorders>
               <w:top w:val="single" w:color="BFBFBF" w:sz="4"/>
               <w:left w:val="single" w:color="BFBFBF" w:sz="4"/>
@@ -6245,7 +6307,7 @@
         </w:tc>
         <w:tc>
           <w:tcPr>
-            <w:tcW w:type="dxa" w:w="2913"/>
+            <w:tcW w:type="dxa" w:w="2821"/>
             <w:tcBorders>
               <w:top w:val="single" w:color="BFBFBF" w:sz="4"/>
               <w:left w:val="single" w:color="BFBFBF" w:sz="4"/>
@@ -6271,7 +6333,7 @@
         </w:tc>
         <w:tc>
           <w:tcPr>
-            <w:tcW w:type="dxa" w:w="1045"/>
+            <w:tcW w:type="dxa" w:w="1032"/>
             <w:tcBorders>
               <w:top w:val="single" w:color="BFBFBF" w:sz="4"/>
               <w:left w:val="single" w:color="BFBFBF" w:sz="4"/>
@@ -6297,7 +6359,7 @@
         </w:tc>
         <w:tc>
           <w:tcPr>
-            <w:tcW w:type="dxa" w:w="1290"/>
+            <w:tcW w:type="dxa" w:w="1267"/>
             <w:tcBorders>
               <w:top w:val="single" w:color="BFBFBF" w:sz="4"/>
               <w:left w:val="single" w:color="BFBFBF" w:sz="4"/>
@@ -6323,7 +6385,7 @@
         </w:tc>
         <w:tc>
           <w:tcPr>
-            <w:tcW w:type="dxa" w:w="3013"/>
+            <w:tcW w:type="dxa" w:w="3154"/>
             <w:tcBorders>
               <w:top w:val="single" w:color="BFBFBF" w:sz="4"/>
               <w:left w:val="single" w:color="BFBFBF" w:sz="4"/>
@@ -6351,7 +6413,7 @@
       <w:tr>
         <w:tc>
           <w:tcPr>
-            <w:tcW w:type="dxa" w:w="1045"/>
+            <w:tcW w:type="dxa" w:w="1032"/>
             <w:tcBorders>
               <w:top w:val="single" w:color="BFBFBF" w:sz="4"/>
               <w:left w:val="single" w:color="BFBFBF" w:sz="4"/>
@@ -6377,7 +6439,7 @@
         </w:tc>
         <w:tc>
           <w:tcPr>
-            <w:tcW w:type="dxa" w:w="2913"/>
+            <w:tcW w:type="dxa" w:w="2821"/>
             <w:tcBorders>
               <w:top w:val="single" w:color="BFBFBF" w:sz="4"/>
               <w:left w:val="single" w:color="BFBFBF" w:sz="4"/>
@@ -6403,7 +6465,7 @@
         </w:tc>
         <w:tc>
           <w:tcPr>
-            <w:tcW w:type="dxa" w:w="1045"/>
+            <w:tcW w:type="dxa" w:w="1032"/>
             <w:tcBorders>
               <w:top w:val="single" w:color="BFBFBF" w:sz="4"/>
               <w:left w:val="single" w:color="BFBFBF" w:sz="4"/>
@@ -6429,7 +6491,7 @@
         </w:tc>
         <w:tc>
           <w:tcPr>
-            <w:tcW w:type="dxa" w:w="1290"/>
+            <w:tcW w:type="dxa" w:w="1267"/>
             <w:tcBorders>
               <w:top w:val="single" w:color="BFBFBF" w:sz="4"/>
               <w:left w:val="single" w:color="BFBFBF" w:sz="4"/>
@@ -6455,7 +6517,7 @@
         </w:tc>
         <w:tc>
           <w:tcPr>
-            <w:tcW w:type="dxa" w:w="3013"/>
+            <w:tcW w:type="dxa" w:w="3154"/>
             <w:tcBorders>
               <w:top w:val="single" w:color="BFBFBF" w:sz="4"/>
               <w:left w:val="single" w:color="BFBFBF" w:sz="4"/>
@@ -6483,7 +6545,7 @@
       <w:tr>
         <w:tc>
           <w:tcPr>
-            <w:tcW w:type="dxa" w:w="1045"/>
+            <w:tcW w:type="dxa" w:w="1032"/>
             <w:tcBorders>
               <w:top w:val="single" w:color="BFBFBF" w:sz="4"/>
               <w:left w:val="single" w:color="BFBFBF" w:sz="4"/>
@@ -6509,7 +6571,7 @@
         </w:tc>
         <w:tc>
           <w:tcPr>
-            <w:tcW w:type="dxa" w:w="2913"/>
+            <w:tcW w:type="dxa" w:w="2821"/>
             <w:tcBorders>
               <w:top w:val="single" w:color="BFBFBF" w:sz="4"/>
               <w:left w:val="single" w:color="BFBFBF" w:sz="4"/>
@@ -6535,7 +6597,7 @@
         </w:tc>
         <w:tc>
           <w:tcPr>
-            <w:tcW w:type="dxa" w:w="1045"/>
+            <w:tcW w:type="dxa" w:w="1032"/>
             <w:tcBorders>
               <w:top w:val="single" w:color="BFBFBF" w:sz="4"/>
               <w:left w:val="single" w:color="BFBFBF" w:sz="4"/>
@@ -6561,7 +6623,7 @@
         </w:tc>
         <w:tc>
           <w:tcPr>
-            <w:tcW w:type="dxa" w:w="1290"/>
+            <w:tcW w:type="dxa" w:w="1267"/>
             <w:tcBorders>
               <w:top w:val="single" w:color="BFBFBF" w:sz="4"/>
               <w:left w:val="single" w:color="BFBFBF" w:sz="4"/>
@@ -6587,27 +6649,27 @@
         </w:tc>
         <w:tc>
           <w:tcPr>
-            <w:tcW w:type="dxa" w:w="3013"/>
-            <w:tcBorders>
-              <w:top w:val="single" w:color="BFBFBF" w:sz="4"/>
-              <w:left w:val="single" w:color="BFBFBF" w:sz="4"/>
-              <w:bottom w:val="single" w:color="BFBFBF" w:sz="4"/>
-              <w:right w:val="single" w:color="BFBFBF" w:sz="4"/>
-            </w:tcBorders>
-            <w:tcMar>
-              <w:top w:type="dxa" w:w="80"/>
-              <w:left w:type="dxa" w:w="120"/>
-              <w:bottom w:type="dxa" w:w="80"/>
-              <w:right w:type="dxa" w:w="120"/>
-            </w:tcMar>
-          </w:tcPr>
-          <w:p>
-            <w:r>
-              <w:rPr>
-                <w:sz w:val="20"/>
-                <w:szCs w:val="20"/>
-              </w:rPr>
-              <w:t xml:space="preserve">T18 y T19, a confirmar.</w:t>
+            <w:tcW w:type="dxa" w:w="3154"/>
+            <w:tcBorders>
+              <w:top w:val="single" w:color="BFBFBF" w:sz="4"/>
+              <w:left w:val="single" w:color="BFBFBF" w:sz="4"/>
+              <w:bottom w:val="single" w:color="BFBFBF" w:sz="4"/>
+              <w:right w:val="single" w:color="BFBFBF" w:sz="4"/>
+            </w:tcBorders>
+            <w:tcMar>
+              <w:top w:type="dxa" w:w="80"/>
+              <w:left w:type="dxa" w:w="120"/>
+              <w:bottom w:type="dxa" w:w="80"/>
+              <w:right w:type="dxa" w:w="120"/>
+            </w:tcMar>
+          </w:tcPr>
+          <w:p>
+            <w:r>
+              <w:rPr>
+                <w:sz w:val="20"/>
+                <w:szCs w:val="20"/>
+              </w:rPr>
+              <w:t xml:space="preserve">T18 y T19, confirmadas en la tabla de transiciones.</w:t>
             </w:r>
           </w:p>
         </w:tc>
@@ -6615,7 +6677,7 @@
       <w:tr>
         <w:tc>
           <w:tcPr>
-            <w:tcW w:type="dxa" w:w="1045"/>
+            <w:tcW w:type="dxa" w:w="1032"/>
             <w:tcBorders>
               <w:top w:val="single" w:color="BFBFBF" w:sz="4"/>
               <w:left w:val="single" w:color="BFBFBF" w:sz="4"/>
@@ -6641,7 +6703,7 @@
         </w:tc>
         <w:tc>
           <w:tcPr>
-            <w:tcW w:type="dxa" w:w="2913"/>
+            <w:tcW w:type="dxa" w:w="2821"/>
             <w:tcBorders>
               <w:top w:val="single" w:color="BFBFBF" w:sz="4"/>
               <w:left w:val="single" w:color="BFBFBF" w:sz="4"/>
@@ -6667,7 +6729,7 @@
         </w:tc>
         <w:tc>
           <w:tcPr>
-            <w:tcW w:type="dxa" w:w="1045"/>
+            <w:tcW w:type="dxa" w:w="1032"/>
             <w:tcBorders>
               <w:top w:val="single" w:color="BFBFBF" w:sz="4"/>
               <w:left w:val="single" w:color="BFBFBF" w:sz="4"/>
@@ -6693,7 +6755,7 @@
         </w:tc>
         <w:tc>
           <w:tcPr>
-            <w:tcW w:type="dxa" w:w="1290"/>
+            <w:tcW w:type="dxa" w:w="1267"/>
             <w:tcBorders>
               <w:top w:val="single" w:color="BFBFBF" w:sz="4"/>
               <w:left w:val="single" w:color="BFBFBF" w:sz="4"/>
@@ -6719,7 +6781,7 @@
         </w:tc>
         <w:tc>
           <w:tcPr>
-            <w:tcW w:type="dxa" w:w="3013"/>
+            <w:tcW w:type="dxa" w:w="3154"/>
             <w:tcBorders>
               <w:top w:val="single" w:color="BFBFBF" w:sz="4"/>
               <w:left w:val="single" w:color="BFBFBF" w:sz="4"/>
@@ -6739,7 +6801,7 @@
       <w:tr>
         <w:tc>
           <w:tcPr>
-            <w:tcW w:type="dxa" w:w="1045"/>
+            <w:tcW w:type="dxa" w:w="1032"/>
             <w:tcBorders>
               <w:top w:val="single" w:color="BFBFBF" w:sz="4"/>
               <w:left w:val="single" w:color="BFBFBF" w:sz="4"/>
@@ -6765,7 +6827,7 @@
         </w:tc>
         <w:tc>
           <w:tcPr>
-            <w:tcW w:type="dxa" w:w="2913"/>
+            <w:tcW w:type="dxa" w:w="2821"/>
             <w:tcBorders>
               <w:top w:val="single" w:color="BFBFBF" w:sz="4"/>
               <w:left w:val="single" w:color="BFBFBF" w:sz="4"/>
@@ -6791,7 +6853,7 @@
         </w:tc>
         <w:tc>
           <w:tcPr>
-            <w:tcW w:type="dxa" w:w="1045"/>
+            <w:tcW w:type="dxa" w:w="1032"/>
             <w:tcBorders>
               <w:top w:val="single" w:color="BFBFBF" w:sz="4"/>
               <w:left w:val="single" w:color="BFBFBF" w:sz="4"/>
@@ -6817,7 +6879,7 @@
         </w:tc>
         <w:tc>
           <w:tcPr>
-            <w:tcW w:type="dxa" w:w="1290"/>
+            <w:tcW w:type="dxa" w:w="1267"/>
             <w:tcBorders>
               <w:top w:val="single" w:color="BFBFBF" w:sz="4"/>
               <w:left w:val="single" w:color="BFBFBF" w:sz="4"/>
@@ -6843,7 +6905,7 @@
         </w:tc>
         <w:tc>
           <w:tcPr>
-            <w:tcW w:type="dxa" w:w="3013"/>
+            <w:tcW w:type="dxa" w:w="3154"/>
             <w:tcBorders>
               <w:top w:val="single" w:color="BFBFBF" w:sz="4"/>
               <w:left w:val="single" w:color="BFBFBF" w:sz="4"/>
@@ -6863,7 +6925,7 @@
       <w:tr>
         <w:tc>
           <w:tcPr>
-            <w:tcW w:type="dxa" w:w="1045"/>
+            <w:tcW w:type="dxa" w:w="1032"/>
             <w:tcBorders>
               <w:top w:val="single" w:color="BFBFBF" w:sz="4"/>
               <w:left w:val="single" w:color="BFBFBF" w:sz="4"/>
@@ -6889,7 +6951,7 @@
         </w:tc>
         <w:tc>
           <w:tcPr>
-            <w:tcW w:type="dxa" w:w="2913"/>
+            <w:tcW w:type="dxa" w:w="2821"/>
             <w:tcBorders>
               <w:top w:val="single" w:color="BFBFBF" w:sz="4"/>
               <w:left w:val="single" w:color="BFBFBF" w:sz="4"/>
@@ -6915,7 +6977,7 @@
         </w:tc>
         <w:tc>
           <w:tcPr>
-            <w:tcW w:type="dxa" w:w="1045"/>
+            <w:tcW w:type="dxa" w:w="1032"/>
             <w:tcBorders>
               <w:top w:val="single" w:color="BFBFBF" w:sz="4"/>
               <w:left w:val="single" w:color="BFBFBF" w:sz="4"/>
@@ -6941,7 +7003,7 @@
         </w:tc>
         <w:tc>
           <w:tcPr>
-            <w:tcW w:type="dxa" w:w="1290"/>
+            <w:tcW w:type="dxa" w:w="1267"/>
             <w:tcBorders>
               <w:top w:val="single" w:color="BFBFBF" w:sz="4"/>
               <w:left w:val="single" w:color="BFBFBF" w:sz="4"/>
@@ -6967,7 +7029,7 @@
         </w:tc>
         <w:tc>
           <w:tcPr>
-            <w:tcW w:type="dxa" w:w="3013"/>
+            <w:tcW w:type="dxa" w:w="3154"/>
             <w:tcBorders>
               <w:top w:val="single" w:color="BFBFBF" w:sz="4"/>
               <w:left w:val="single" w:color="BFBFBF" w:sz="4"/>
@@ -8047,11 +8109,11 @@
         </w:tblBorders>
       </w:tblPr>
       <w:tblGrid>
-        <w:gridCol w:w="1400"/>
-        <w:gridCol w:w="2852"/>
-        <w:gridCol w:w="1050"/>
-        <w:gridCol w:w="1300"/>
-        <w:gridCol w:w="2704"/>
+        <w:gridCol w:w="1301"/>
+        <w:gridCol w:w="2531"/>
+        <w:gridCol w:w="1004"/>
+        <w:gridCol w:w="1216"/>
+        <w:gridCol w:w="3254"/>
       </w:tblGrid>
       <w:tr>
         <w:trPr>
@@ -8059,7 +8121,7 @@
         </w:trPr>
         <w:tc>
           <w:tcPr>
-            <w:tcW w:type="dxa" w:w="1400"/>
+            <w:tcW w:type="dxa" w:w="1301"/>
             <w:tcBorders>
               <w:top w:val="single" w:color="BFBFBF" w:sz="4"/>
               <w:left w:val="single" w:color="BFBFBF" w:sz="4"/>
@@ -8088,7 +8150,7 @@
         </w:tc>
         <w:tc>
           <w:tcPr>
-            <w:tcW w:type="dxa" w:w="2852"/>
+            <w:tcW w:type="dxa" w:w="2531"/>
             <w:tcBorders>
               <w:top w:val="single" w:color="BFBFBF" w:sz="4"/>
               <w:left w:val="single" w:color="BFBFBF" w:sz="4"/>
@@ -8117,7 +8179,7 @@
         </w:tc>
         <w:tc>
           <w:tcPr>
-            <w:tcW w:type="dxa" w:w="1050"/>
+            <w:tcW w:type="dxa" w:w="1004"/>
             <w:tcBorders>
               <w:top w:val="single" w:color="BFBFBF" w:sz="4"/>
               <w:left w:val="single" w:color="BFBFBF" w:sz="4"/>
@@ -8146,7 +8208,7 @@
         </w:tc>
         <w:tc>
           <w:tcPr>
-            <w:tcW w:type="dxa" w:w="1300"/>
+            <w:tcW w:type="dxa" w:w="1216"/>
             <w:tcBorders>
               <w:top w:val="single" w:color="BFBFBF" w:sz="4"/>
               <w:left w:val="single" w:color="BFBFBF" w:sz="4"/>
@@ -8175,7 +8237,7 @@
         </w:tc>
         <w:tc>
           <w:tcPr>
-            <w:tcW w:type="dxa" w:w="2704"/>
+            <w:tcW w:type="dxa" w:w="3254"/>
             <w:tcBorders>
               <w:top w:val="single" w:color="BFBFBF" w:sz="4"/>
               <w:left w:val="single" w:color="BFBFBF" w:sz="4"/>
@@ -8206,7 +8268,7 @@
       <w:tr>
         <w:tc>
           <w:tcPr>
-            <w:tcW w:type="dxa" w:w="1400"/>
+            <w:tcW w:type="dxa" w:w="1301"/>
             <w:tcBorders>
               <w:top w:val="single" w:color="BFBFBF" w:sz="4"/>
               <w:left w:val="single" w:color="BFBFBF" w:sz="4"/>
@@ -8232,7 +8294,7 @@
         </w:tc>
         <w:tc>
           <w:tcPr>
-            <w:tcW w:type="dxa" w:w="2852"/>
+            <w:tcW w:type="dxa" w:w="2531"/>
             <w:tcBorders>
               <w:top w:val="single" w:color="BFBFBF" w:sz="4"/>
               <w:left w:val="single" w:color="BFBFBF" w:sz="4"/>
@@ -8258,33 +8320,33 @@
         </w:tc>
         <w:tc>
           <w:tcPr>
-            <w:tcW w:type="dxa" w:w="1050"/>
-            <w:tcBorders>
-              <w:top w:val="single" w:color="BFBFBF" w:sz="4"/>
-              <w:left w:val="single" w:color="BFBFBF" w:sz="4"/>
-              <w:bottom w:val="single" w:color="BFBFBF" w:sz="4"/>
-              <w:right w:val="single" w:color="BFBFBF" w:sz="4"/>
-            </w:tcBorders>
-            <w:tcMar>
-              <w:top w:type="dxa" w:w="80"/>
-              <w:left w:type="dxa" w:w="120"/>
-              <w:bottom w:type="dxa" w:w="80"/>
-              <w:right w:type="dxa" w:w="120"/>
-            </w:tcMar>
-          </w:tcPr>
-          <w:p>
-            <w:r>
-              <w:rPr>
-                <w:sz w:val="20"/>
-                <w:szCs w:val="20"/>
-              </w:rPr>
-              <w:t xml:space="preserve">M</w:t>
-            </w:r>
-          </w:p>
-        </w:tc>
-        <w:tc>
-          <w:tcPr>
-            <w:tcW w:type="dxa" w:w="1300"/>
+            <w:tcW w:type="dxa" w:w="1004"/>
+            <w:tcBorders>
+              <w:top w:val="single" w:color="BFBFBF" w:sz="4"/>
+              <w:left w:val="single" w:color="BFBFBF" w:sz="4"/>
+              <w:bottom w:val="single" w:color="BFBFBF" w:sz="4"/>
+              <w:right w:val="single" w:color="BFBFBF" w:sz="4"/>
+            </w:tcBorders>
+            <w:tcMar>
+              <w:top w:type="dxa" w:w="80"/>
+              <w:left w:type="dxa" w:w="120"/>
+              <w:bottom w:type="dxa" w:w="80"/>
+              <w:right w:type="dxa" w:w="120"/>
+            </w:tcMar>
+          </w:tcPr>
+          <w:p>
+            <w:r>
+              <w:rPr>
+                <w:sz w:val="20"/>
+                <w:szCs w:val="20"/>
+              </w:rPr>
+              <w:t xml:space="preserve">C</w:t>
+            </w:r>
+          </w:p>
+        </w:tc>
+        <w:tc>
+          <w:tcPr>
+            <w:tcW w:type="dxa" w:w="1216"/>
             <w:tcBorders>
               <w:top w:val="single" w:color="BFBFBF" w:sz="4"/>
               <w:left w:val="single" w:color="BFBFBF" w:sz="4"/>
@@ -8310,27 +8372,27 @@
         </w:tc>
         <w:tc>
           <w:tcPr>
-            <w:tcW w:type="dxa" w:w="2704"/>
-            <w:tcBorders>
-              <w:top w:val="single" w:color="BFBFBF" w:sz="4"/>
-              <w:left w:val="single" w:color="BFBFBF" w:sz="4"/>
-              <w:bottom w:val="single" w:color="BFBFBF" w:sz="4"/>
-              <w:right w:val="single" w:color="BFBFBF" w:sz="4"/>
-            </w:tcBorders>
-            <w:tcMar>
-              <w:top w:type="dxa" w:w="80"/>
-              <w:left w:type="dxa" w:w="120"/>
-              <w:bottom w:type="dxa" w:w="80"/>
-              <w:right w:type="dxa" w:w="120"/>
-            </w:tcMar>
-          </w:tcPr>
-          <w:p>
-            <w:r>
-              <w:rPr>
-                <w:sz w:val="20"/>
-                <w:szCs w:val="20"/>
-              </w:rPr>
-              <w:t xml:space="preserve">Opcional 7.4 (3 puntos). Ver sección 4.</w:t>
+            <w:tcW w:type="dxa" w:w="3254"/>
+            <w:tcBorders>
+              <w:top w:val="single" w:color="BFBFBF" w:sz="4"/>
+              <w:left w:val="single" w:color="BFBFBF" w:sz="4"/>
+              <w:bottom w:val="single" w:color="BFBFBF" w:sz="4"/>
+              <w:right w:val="single" w:color="BFBFBF" w:sz="4"/>
+            </w:tcBorders>
+            <w:tcMar>
+              <w:top w:type="dxa" w:w="80"/>
+              <w:left w:type="dxa" w:w="120"/>
+              <w:bottom w:type="dxa" w:w="80"/>
+              <w:right w:type="dxa" w:w="120"/>
+            </w:tcMar>
+          </w:tcPr>
+          <w:p>
+            <w:r>
+              <w:rPr>
+                <w:sz w:val="20"/>
+                <w:szCs w:val="20"/>
+              </w:rPr>
+              <w:t xml:space="preserve">Opcional 7.4 (3 puntos): completo o no suma. Ver sección 4.</w:t>
             </w:r>
           </w:p>
         </w:tc>
@@ -8338,7 +8400,7 @@
       <w:tr>
         <w:tc>
           <w:tcPr>
-            <w:tcW w:type="dxa" w:w="1400"/>
+            <w:tcW w:type="dxa" w:w="1301"/>
             <w:tcBorders>
               <w:top w:val="single" w:color="BFBFBF" w:sz="4"/>
               <w:left w:val="single" w:color="BFBFBF" w:sz="4"/>
@@ -8364,7 +8426,7 @@
         </w:tc>
         <w:tc>
           <w:tcPr>
-            <w:tcW w:type="dxa" w:w="2852"/>
+            <w:tcW w:type="dxa" w:w="2531"/>
             <w:tcBorders>
               <w:top w:val="single" w:color="BFBFBF" w:sz="4"/>
               <w:left w:val="single" w:color="BFBFBF" w:sz="4"/>
@@ -8390,7 +8452,7 @@
         </w:tc>
         <w:tc>
           <w:tcPr>
-            <w:tcW w:type="dxa" w:w="1050"/>
+            <w:tcW w:type="dxa" w:w="1004"/>
             <w:tcBorders>
               <w:top w:val="single" w:color="BFBFBF" w:sz="4"/>
               <w:left w:val="single" w:color="BFBFBF" w:sz="4"/>
@@ -8416,7 +8478,7 @@
         </w:tc>
         <w:tc>
           <w:tcPr>
-            <w:tcW w:type="dxa" w:w="1300"/>
+            <w:tcW w:type="dxa" w:w="1216"/>
             <w:tcBorders>
               <w:top w:val="single" w:color="BFBFBF" w:sz="4"/>
               <w:left w:val="single" w:color="BFBFBF" w:sz="4"/>
@@ -8442,7 +8504,7 @@
         </w:tc>
         <w:tc>
           <w:tcPr>
-            <w:tcW w:type="dxa" w:w="2704"/>
+            <w:tcW w:type="dxa" w:w="3254"/>
             <w:tcBorders>
               <w:top w:val="single" w:color="BFBFBF" w:sz="4"/>
               <w:left w:val="single" w:color="BFBFBF" w:sz="4"/>
@@ -8462,7 +8524,7 @@
       <w:tr>
         <w:tc>
           <w:tcPr>
-            <w:tcW w:type="dxa" w:w="1400"/>
+            <w:tcW w:type="dxa" w:w="1301"/>
             <w:tcBorders>
               <w:top w:val="single" w:color="BFBFBF" w:sz="4"/>
               <w:left w:val="single" w:color="BFBFBF" w:sz="4"/>
@@ -8488,7 +8550,7 @@
         </w:tc>
         <w:tc>
           <w:tcPr>
-            <w:tcW w:type="dxa" w:w="2852"/>
+            <w:tcW w:type="dxa" w:w="2531"/>
             <w:tcBorders>
               <w:top w:val="single" w:color="BFBFBF" w:sz="4"/>
               <w:left w:val="single" w:color="BFBFBF" w:sz="4"/>
@@ -8514,7 +8576,7 @@
         </w:tc>
         <w:tc>
           <w:tcPr>
-            <w:tcW w:type="dxa" w:w="1050"/>
+            <w:tcW w:type="dxa" w:w="1004"/>
             <w:tcBorders>
               <w:top w:val="single" w:color="BFBFBF" w:sz="4"/>
               <w:left w:val="single" w:color="BFBFBF" w:sz="4"/>
@@ -8540,7 +8602,7 @@
         </w:tc>
         <w:tc>
           <w:tcPr>
-            <w:tcW w:type="dxa" w:w="1300"/>
+            <w:tcW w:type="dxa" w:w="1216"/>
             <w:tcBorders>
               <w:top w:val="single" w:color="BFBFBF" w:sz="4"/>
               <w:left w:val="single" w:color="BFBFBF" w:sz="4"/>
@@ -8566,7 +8628,7 @@
         </w:tc>
         <w:tc>
           <w:tcPr>
-            <w:tcW w:type="dxa" w:w="2704"/>
+            <w:tcW w:type="dxa" w:w="3254"/>
             <w:tcBorders>
               <w:top w:val="single" w:color="BFBFBF" w:sz="4"/>
               <w:left w:val="single" w:color="BFBFBF" w:sz="4"/>
@@ -8586,7 +8648,7 @@
       <w:tr>
         <w:tc>
           <w:tcPr>
-            <w:tcW w:type="dxa" w:w="1400"/>
+            <w:tcW w:type="dxa" w:w="1301"/>
             <w:tcBorders>
               <w:top w:val="single" w:color="BFBFBF" w:sz="4"/>
               <w:left w:val="single" w:color="BFBFBF" w:sz="4"/>
@@ -8612,7 +8674,7 @@
         </w:tc>
         <w:tc>
           <w:tcPr>
-            <w:tcW w:type="dxa" w:w="2852"/>
+            <w:tcW w:type="dxa" w:w="2531"/>
             <w:tcBorders>
               <w:top w:val="single" w:color="BFBFBF" w:sz="4"/>
               <w:left w:val="single" w:color="BFBFBF" w:sz="4"/>
@@ -8638,7 +8700,7 @@
         </w:tc>
         <w:tc>
           <w:tcPr>
-            <w:tcW w:type="dxa" w:w="1050"/>
+            <w:tcW w:type="dxa" w:w="1004"/>
             <w:tcBorders>
               <w:top w:val="single" w:color="BFBFBF" w:sz="4"/>
               <w:left w:val="single" w:color="BFBFBF" w:sz="4"/>
@@ -8664,7 +8726,7 @@
         </w:tc>
         <w:tc>
           <w:tcPr>
-            <w:tcW w:type="dxa" w:w="1300"/>
+            <w:tcW w:type="dxa" w:w="1216"/>
             <w:tcBorders>
               <w:top w:val="single" w:color="BFBFBF" w:sz="4"/>
               <w:left w:val="single" w:color="BFBFBF" w:sz="4"/>
@@ -8690,7 +8752,7 @@
         </w:tc>
         <w:tc>
           <w:tcPr>
-            <w:tcW w:type="dxa" w:w="2704"/>
+            <w:tcW w:type="dxa" w:w="3254"/>
             <w:tcBorders>
               <w:top w:val="single" w:color="BFBFBF" w:sz="4"/>
               <w:left w:val="single" w:color="BFBFBF" w:sz="4"/>
@@ -8710,7 +8772,7 @@
       <w:tr>
         <w:tc>
           <w:tcPr>
-            <w:tcW w:type="dxa" w:w="1400"/>
+            <w:tcW w:type="dxa" w:w="1301"/>
             <w:tcBorders>
               <w:top w:val="single" w:color="BFBFBF" w:sz="4"/>
               <w:left w:val="single" w:color="BFBFBF" w:sz="4"/>
@@ -8736,7 +8798,7 @@
         </w:tc>
         <w:tc>
           <w:tcPr>
-            <w:tcW w:type="dxa" w:w="2852"/>
+            <w:tcW w:type="dxa" w:w="2531"/>
             <w:tcBorders>
               <w:top w:val="single" w:color="BFBFBF" w:sz="4"/>
               <w:left w:val="single" w:color="BFBFBF" w:sz="4"/>
@@ -8762,7 +8824,7 @@
         </w:tc>
         <w:tc>
           <w:tcPr>
-            <w:tcW w:type="dxa" w:w="1050"/>
+            <w:tcW w:type="dxa" w:w="1004"/>
             <w:tcBorders>
               <w:top w:val="single" w:color="BFBFBF" w:sz="4"/>
               <w:left w:val="single" w:color="BFBFBF" w:sz="4"/>
@@ -8788,7 +8850,7 @@
         </w:tc>
         <w:tc>
           <w:tcPr>
-            <w:tcW w:type="dxa" w:w="1300"/>
+            <w:tcW w:type="dxa" w:w="1216"/>
             <w:tcBorders>
               <w:top w:val="single" w:color="BFBFBF" w:sz="4"/>
               <w:left w:val="single" w:color="BFBFBF" w:sz="4"/>
@@ -8814,7 +8876,7 @@
         </w:tc>
         <w:tc>
           <w:tcPr>
-            <w:tcW w:type="dxa" w:w="2704"/>
+            <w:tcW w:type="dxa" w:w="3254"/>
             <w:tcBorders>
               <w:top w:val="single" w:color="BFBFBF" w:sz="4"/>
               <w:left w:val="single" w:color="BFBFBF" w:sz="4"/>
@@ -8834,7 +8896,7 @@
       <w:tr>
         <w:tc>
           <w:tcPr>
-            <w:tcW w:type="dxa" w:w="1400"/>
+            <w:tcW w:type="dxa" w:w="1301"/>
             <w:tcBorders>
               <w:top w:val="single" w:color="BFBFBF" w:sz="4"/>
               <w:left w:val="single" w:color="BFBFBF" w:sz="4"/>
@@ -8860,7 +8922,7 @@
         </w:tc>
         <w:tc>
           <w:tcPr>
-            <w:tcW w:type="dxa" w:w="2852"/>
+            <w:tcW w:type="dxa" w:w="2531"/>
             <w:tcBorders>
               <w:top w:val="single" w:color="BFBFBF" w:sz="4"/>
               <w:left w:val="single" w:color="BFBFBF" w:sz="4"/>
@@ -8886,7 +8948,7 @@
         </w:tc>
         <w:tc>
           <w:tcPr>
-            <w:tcW w:type="dxa" w:w="1050"/>
+            <w:tcW w:type="dxa" w:w="1004"/>
             <w:tcBorders>
               <w:top w:val="single" w:color="BFBFBF" w:sz="4"/>
               <w:left w:val="single" w:color="BFBFBF" w:sz="4"/>
@@ -8912,7 +8974,7 @@
         </w:tc>
         <w:tc>
           <w:tcPr>
-            <w:tcW w:type="dxa" w:w="1300"/>
+            <w:tcW w:type="dxa" w:w="1216"/>
             <w:tcBorders>
               <w:top w:val="single" w:color="BFBFBF" w:sz="4"/>
               <w:left w:val="single" w:color="BFBFBF" w:sz="4"/>
@@ -8938,7 +9000,7 @@
         </w:tc>
         <w:tc>
           <w:tcPr>
-            <w:tcW w:type="dxa" w:w="2704"/>
+            <w:tcW w:type="dxa" w:w="3254"/>
             <w:tcBorders>
               <w:top w:val="single" w:color="BFBFBF" w:sz="4"/>
               <w:left w:val="single" w:color="BFBFBF" w:sz="4"/>
@@ -8981,7 +9043,7 @@
         <w:t xml:space="preserve">Trabajo transversal:</w:t>
       </w:r>
       <w:r>
-        <w:t xml:space="preserve"> opcionales restantes hasta llegar a 8 puntos; corrección de errores; documentación final, bitácora de IA y registro de horas; ensayo de la presentación (todo el equipo).</w:t>
+        <w:t xml:space="preserve"> cerrar los cuatro opcionales de la sección 4 con todas sus condiciones; corrección de errores; documentación final, bitácora de IA y registro de horas; ensayo de la presentación (todo el equipo).</w:t>
       </w:r>
     </w:p>
     <w:p>
@@ -9896,33 +9958,33 @@
                 <w:sz w:val="20"/>
                 <w:szCs w:val="20"/>
               </w:rPr>
+              <w:t xml:space="preserve">4</w:t>
+            </w:r>
+          </w:p>
+        </w:tc>
+        <w:tc>
+          <w:tcPr>
+            <w:tcW w:type="dxa" w:w="1861"/>
+            <w:tcBorders>
+              <w:top w:val="single" w:color="BFBFBF" w:sz="4"/>
+              <w:left w:val="single" w:color="BFBFBF" w:sz="4"/>
+              <w:bottom w:val="single" w:color="BFBFBF" w:sz="4"/>
+              <w:right w:val="single" w:color="BFBFBF" w:sz="4"/>
+            </w:tcBorders>
+            <w:tcMar>
+              <w:top w:type="dxa" w:w="80"/>
+              <w:left w:type="dxa" w:w="120"/>
+              <w:bottom w:type="dxa" w:w="80"/>
+              <w:right w:type="dxa" w:w="120"/>
+            </w:tcMar>
+          </w:tcPr>
+          <w:p>
+            <w:r>
+              <w:rPr>
+                <w:sz w:val="20"/>
+                <w:szCs w:val="20"/>
+              </w:rPr>
               <w:t xml:space="preserve">0</w:t>
-            </w:r>
-          </w:p>
-        </w:tc>
-        <w:tc>
-          <w:tcPr>
-            <w:tcW w:type="dxa" w:w="1861"/>
-            <w:tcBorders>
-              <w:top w:val="single" w:color="BFBFBF" w:sz="4"/>
-              <w:left w:val="single" w:color="BFBFBF" w:sz="4"/>
-              <w:bottom w:val="single" w:color="BFBFBF" w:sz="4"/>
-              <w:right w:val="single" w:color="BFBFBF" w:sz="4"/>
-            </w:tcBorders>
-            <w:tcMar>
-              <w:top w:type="dxa" w:w="80"/>
-              <w:left w:type="dxa" w:w="120"/>
-              <w:bottom w:type="dxa" w:w="80"/>
-              <w:right w:type="dxa" w:w="120"/>
-            </w:tcMar>
-          </w:tcPr>
-          <w:p>
-            <w:r>
-              <w:rPr>
-                <w:sz w:val="20"/>
-                <w:szCs w:val="20"/>
-              </w:rPr>
-              <w:t xml:space="preserve">4</w:t>
             </w:r>
           </w:p>
         </w:tc>
@@ -10034,7 +10096,7 @@
                 <w:sz w:val="20"/>
                 <w:szCs w:val="20"/>
               </w:rPr>
-              <w:t xml:space="preserve">16</w:t>
+              <w:t xml:space="preserve">20</w:t>
             </w:r>
           </w:p>
         </w:tc>
@@ -10062,7 +10124,7 @@
                 <w:sz w:val="20"/>
                 <w:szCs w:val="20"/>
               </w:rPr>
-              <w:t xml:space="preserve">25</w:t>
+              <w:t xml:space="preserve">21</w:t>
             </w:r>
           </w:p>
         </w:tc>
@@ -10285,7 +10347,7 @@
                 <w:sz w:val="20"/>
                 <w:szCs w:val="20"/>
               </w:rPr>
-              <w:t xml:space="preserve">5</w:t>
+              <w:t xml:space="preserve">9</w:t>
             </w:r>
           </w:p>
         </w:tc>
@@ -10461,7 +10523,7 @@
         <w:spacing w:after="140" w:line="276"/>
       </w:pPr>
       <w:r>
-        <w:t xml:space="preserve">La cantidad de casos está equilibrada. Ezequiel concentra los de mayor complejidad (sincronización y avisos) además de la infraestructura y el despliegue, por lo que su carga en horas es mayor en los hitos del 22/10 y el 5/11. Si hiciera falta compensarla, la opción natural es que Lucas tome CU-52, ya que es responsable del resto de la PWA.</w:t>
+        <w:t xml:space="preserve">La cantidad de casos está equilibrada. Lucas suma cuatro casos completos por la API pública, que se concentran en el último hito. Ezequiel concentra los de mayor complejidad (sincronización y avisos) además de la infraestructura y el despliegue, por lo que su carga en horas es mayor en los hitos del 22/10 y el 5/11. Si hiciera falta compensarla, la opción natural es que Lucas tome CU-52, ya que es responsable del resto de la PWA.</w:t>
       </w:r>
     </w:p>
     <w:p>
@@ -10469,7 +10531,25 @@
         <w:pStyle w:val="Heading1"/>
       </w:pPr>
       <w:r>
-        <w:t xml:space="preserve">4. Decisiones abiertas del plan</w:t>
+        <w:t xml:space="preserve">4. Requerimientos opcionales</w:t>
+      </w:r>
+    </w:p>
+    <w:p>
+      <w:pPr>
+        <w:spacing w:after="140" w:line="276"/>
+      </w:pPr>
+      <w:r>
+        <w:t xml:space="preserve">Los equipos de 3 integrantes deben cubrir al menos </w:t>
+      </w:r>
+      <w:r>
+        <w:rPr>
+          <w:b/>
+          <w:bCs/>
+        </w:rPr>
+        <w:t xml:space="preserve">8 puntos</w:t>
+      </w:r>
+      <w:r>
+        <w:t xml:space="preserve"> (letra, sección 7). Combinación elegida:</w:t>
       </w:r>
     </w:p>
     <w:tbl>
@@ -10485,8 +10565,11 @@
         </w:tblBorders>
       </w:tblPr>
       <w:tblGrid>
-        <w:gridCol w:w="2864"/>
-        <w:gridCol w:w="6442"/>
+        <w:gridCol w:w="1841"/>
+        <w:gridCol w:w="942"/>
+        <w:gridCol w:w="2998"/>
+        <w:gridCol w:w="1103"/>
+        <w:gridCol w:w="2422"/>
       </w:tblGrid>
       <w:tr>
         <w:trPr>
@@ -10494,7 +10577,7 @@
         </w:trPr>
         <w:tc>
           <w:tcPr>
-            <w:tcW w:type="dxa" w:w="2864"/>
+            <w:tcW w:type="dxa" w:w="1841"/>
             <w:tcBorders>
               <w:top w:val="single" w:color="BFBFBF" w:sz="4"/>
               <w:left w:val="single" w:color="BFBFBF" w:sz="4"/>
@@ -10517,13 +10600,13 @@
                 <w:sz w:val="20"/>
                 <w:szCs w:val="20"/>
               </w:rPr>
-              <w:t xml:space="preserve">Tema</w:t>
-            </w:r>
-          </w:p>
-        </w:tc>
-        <w:tc>
-          <w:tcPr>
-            <w:tcW w:type="dxa" w:w="6442"/>
+              <w:t xml:space="preserve">Opcional</w:t>
+            </w:r>
+          </w:p>
+        </w:tc>
+        <w:tc>
+          <w:tcPr>
+            <w:tcW w:type="dxa" w:w="942"/>
             <w:tcBorders>
               <w:top w:val="single" w:color="BFBFBF" w:sz="4"/>
               <w:left w:val="single" w:color="BFBFBF" w:sz="4"/>
@@ -10546,7 +10629,94 @@
                 <w:sz w:val="20"/>
                 <w:szCs w:val="20"/>
               </w:rPr>
-              <w:t xml:space="preserve">Por qué importa</w:t>
+              <w:t xml:space="preserve">Puntos</w:t>
+            </w:r>
+          </w:p>
+        </w:tc>
+        <w:tc>
+          <w:tcPr>
+            <w:tcW w:type="dxa" w:w="2998"/>
+            <w:tcBorders>
+              <w:top w:val="single" w:color="BFBFBF" w:sz="4"/>
+              <w:left w:val="single" w:color="BFBFBF" w:sz="4"/>
+              <w:bottom w:val="single" w:color="BFBFBF" w:sz="4"/>
+              <w:right w:val="single" w:color="BFBFBF" w:sz="4"/>
+            </w:tcBorders>
+            <w:shd w:fill="D9E2F3" w:color="auto" w:val="clear"/>
+            <w:tcMar>
+              <w:top w:type="dxa" w:w="80"/>
+              <w:left w:type="dxa" w:w="120"/>
+              <w:bottom w:type="dxa" w:w="80"/>
+              <w:right w:type="dxa" w:w="120"/>
+            </w:tcMar>
+          </w:tcPr>
+          <w:p>
+            <w:r>
+              <w:rPr>
+                <w:b/>
+                <w:bCs/>
+                <w:sz w:val="20"/>
+                <w:szCs w:val="20"/>
+              </w:rPr>
+              <w:t xml:space="preserve">Condiciones de la letra (todas obligatorias)</w:t>
+            </w:r>
+          </w:p>
+        </w:tc>
+        <w:tc>
+          <w:tcPr>
+            <w:tcW w:type="dxa" w:w="1103"/>
+            <w:tcBorders>
+              <w:top w:val="single" w:color="BFBFBF" w:sz="4"/>
+              <w:left w:val="single" w:color="BFBFBF" w:sz="4"/>
+              <w:bottom w:val="single" w:color="BFBFBF" w:sz="4"/>
+              <w:right w:val="single" w:color="BFBFBF" w:sz="4"/>
+            </w:tcBorders>
+            <w:shd w:fill="D9E2F3" w:color="auto" w:val="clear"/>
+            <w:tcMar>
+              <w:top w:type="dxa" w:w="80"/>
+              <w:left w:type="dxa" w:w="120"/>
+              <w:bottom w:type="dxa" w:w="80"/>
+              <w:right w:type="dxa" w:w="120"/>
+            </w:tcMar>
+          </w:tcPr>
+          <w:p>
+            <w:r>
+              <w:rPr>
+                <w:b/>
+                <w:bCs/>
+                <w:sz w:val="20"/>
+                <w:szCs w:val="20"/>
+              </w:rPr>
+              <w:t xml:space="preserve">Responsable</w:t>
+            </w:r>
+          </w:p>
+        </w:tc>
+        <w:tc>
+          <w:tcPr>
+            <w:tcW w:type="dxa" w:w="2422"/>
+            <w:tcBorders>
+              <w:top w:val="single" w:color="BFBFBF" w:sz="4"/>
+              <w:left w:val="single" w:color="BFBFBF" w:sz="4"/>
+              <w:bottom w:val="single" w:color="BFBFBF" w:sz="4"/>
+              <w:right w:val="single" w:color="BFBFBF" w:sz="4"/>
+            </w:tcBorders>
+            <w:shd w:fill="D9E2F3" w:color="auto" w:val="clear"/>
+            <w:tcMar>
+              <w:top w:type="dxa" w:w="80"/>
+              <w:left w:type="dxa" w:w="120"/>
+              <w:bottom w:type="dxa" w:w="80"/>
+              <w:right w:type="dxa" w:w="120"/>
+            </w:tcMar>
+          </w:tcPr>
+          <w:p>
+            <w:r>
+              <w:rPr>
+                <w:b/>
+                <w:bCs/>
+                <w:sz w:val="20"/>
+                <w:szCs w:val="20"/>
+              </w:rPr>
+              <w:t xml:space="preserve">Hito</w:t>
             </w:r>
           </w:p>
         </w:tc>
@@ -10554,54 +10724,21 @@
       <w:tr>
         <w:tc>
           <w:tcPr>
-            <w:tcW w:type="dxa" w:w="2864"/>
-            <w:tcBorders>
-              <w:top w:val="single" w:color="BFBFBF" w:sz="4"/>
-              <w:left w:val="single" w:color="BFBFBF" w:sz="4"/>
-              <w:bottom w:val="single" w:color="BFBFBF" w:sz="4"/>
-              <w:right w:val="single" w:color="BFBFBF" w:sz="4"/>
-            </w:tcBorders>
-            <w:tcMar>
-              <w:top w:type="dxa" w:w="80"/>
-              <w:left w:type="dxa" w:w="120"/>
-              <w:bottom w:type="dxa" w:w="80"/>
-              <w:right w:type="dxa" w:w="120"/>
-            </w:tcMar>
-          </w:tcPr>
-          <w:p>
-            <w:r>
-              <w:rPr>
-                <w:sz w:val="20"/>
-                <w:szCs w:val="20"/>
-              </w:rPr>
-              <w:t xml:space="preserve">API pública (opcional 7.4)</w:t>
-            </w:r>
-          </w:p>
-        </w:tc>
-        <w:tc>
-          <w:tcPr>
-            <w:tcW w:type="dxa" w:w="6442"/>
-            <w:tcBorders>
-              <w:top w:val="single" w:color="BFBFBF" w:sz="4"/>
-              <w:left w:val="single" w:color="BFBFBF" w:sz="4"/>
-              <w:bottom w:val="single" w:color="BFBFBF" w:sz="4"/>
-              <w:right w:val="single" w:color="BFBFBF" w:sz="4"/>
-            </w:tcBorders>
-            <w:tcMar>
-              <w:top w:type="dxa" w:w="80"/>
-              <w:left w:type="dxa" w:w="120"/>
-              <w:bottom w:type="dxa" w:w="80"/>
-              <w:right w:type="dxa" w:w="120"/>
-            </w:tcMar>
-          </w:tcPr>
-          <w:p>
-            <w:r>
-              <w:rPr>
-                <w:sz w:val="20"/>
-                <w:szCs w:val="20"/>
-              </w:rPr>
-              <w:t xml:space="preserve">Vale 3 puntos, pero es de los opcionales más costosos (claves, ambiente de pruebas, limitación de tasa, documentación). Hay opcionales de 2 puntos que salen casi solos con lo que ya está armado: </w:t>
-            </w:r>
+            <w:tcW w:type="dxa" w:w="1841"/>
+            <w:tcBorders>
+              <w:top w:val="single" w:color="BFBFBF" w:sz="4"/>
+              <w:left w:val="single" w:color="BFBFBF" w:sz="4"/>
+              <w:bottom w:val="single" w:color="BFBFBF" w:sz="4"/>
+              <w:right w:val="single" w:color="BFBFBF" w:sz="4"/>
+            </w:tcBorders>
+            <w:tcMar>
+              <w:top w:type="dxa" w:w="80"/>
+              <w:left w:type="dxa" w:w="120"/>
+              <w:bottom w:type="dxa" w:w="80"/>
+              <w:right w:type="dxa" w:w="120"/>
+            </w:tcMar>
+          </w:tcPr>
+          <w:p>
             <w:r>
               <w:rPr>
                 <w:b/>
@@ -10609,15 +10746,140 @@
                 <w:sz w:val="20"/>
                 <w:szCs w:val="20"/>
               </w:rPr>
-              <w:t xml:space="preserve">cobertura de pruebas superior al 70 %</w:t>
-            </w:r>
-            <w:r>
-              <w:rPr>
-                <w:sz w:val="20"/>
-                <w:szCs w:val="20"/>
-              </w:rPr>
-              <w:t xml:space="preserve"> y </w:t>
-            </w:r>
+              <w:t xml:space="preserve">API pública para comercios</w:t>
+            </w:r>
+            <w:r>
+              <w:rPr>
+                <w:sz w:val="20"/>
+                <w:szCs w:val="20"/>
+              </w:rPr>
+              <w:t xml:space="preserve"> (7.4)</w:t>
+            </w:r>
+          </w:p>
+        </w:tc>
+        <w:tc>
+          <w:tcPr>
+            <w:tcW w:type="dxa" w:w="942"/>
+            <w:tcBorders>
+              <w:top w:val="single" w:color="BFBFBF" w:sz="4"/>
+              <w:left w:val="single" w:color="BFBFBF" w:sz="4"/>
+              <w:bottom w:val="single" w:color="BFBFBF" w:sz="4"/>
+              <w:right w:val="single" w:color="BFBFBF" w:sz="4"/>
+            </w:tcBorders>
+            <w:tcMar>
+              <w:top w:type="dxa" w:w="80"/>
+              <w:left w:type="dxa" w:w="120"/>
+              <w:bottom w:type="dxa" w:w="80"/>
+              <w:right w:type="dxa" w:w="120"/>
+            </w:tcMar>
+          </w:tcPr>
+          <w:p>
+            <w:r>
+              <w:rPr>
+                <w:sz w:val="20"/>
+                <w:szCs w:val="20"/>
+              </w:rPr>
+              <w:t xml:space="preserve">3</w:t>
+            </w:r>
+          </w:p>
+        </w:tc>
+        <w:tc>
+          <w:tcPr>
+            <w:tcW w:type="dxa" w:w="2998"/>
+            <w:tcBorders>
+              <w:top w:val="single" w:color="BFBFBF" w:sz="4"/>
+              <w:left w:val="single" w:color="BFBFBF" w:sz="4"/>
+              <w:bottom w:val="single" w:color="BFBFBF" w:sz="4"/>
+              <w:right w:val="single" w:color="BFBFBF" w:sz="4"/>
+            </w:tcBorders>
+            <w:tcMar>
+              <w:top w:type="dxa" w:w="80"/>
+              <w:left w:type="dxa" w:w="120"/>
+              <w:bottom w:type="dxa" w:w="80"/>
+              <w:right w:type="dxa" w:w="120"/>
+            </w:tcMar>
+          </w:tcPr>
+          <w:p>
+            <w:r>
+              <w:rPr>
+                <w:sz w:val="20"/>
+                <w:szCs w:val="20"/>
+              </w:rPr>
+              <w:t xml:space="preserve">API documentada y versionada; claves por comercio; ambiente de pruebas; limitación de tasa diferenciada; documentación navegable. Casos CU-80 a CU-83.</w:t>
+            </w:r>
+          </w:p>
+        </w:tc>
+        <w:tc>
+          <w:tcPr>
+            <w:tcW w:type="dxa" w:w="1103"/>
+            <w:tcBorders>
+              <w:top w:val="single" w:color="BFBFBF" w:sz="4"/>
+              <w:left w:val="single" w:color="BFBFBF" w:sz="4"/>
+              <w:bottom w:val="single" w:color="BFBFBF" w:sz="4"/>
+              <w:right w:val="single" w:color="BFBFBF" w:sz="4"/>
+            </w:tcBorders>
+            <w:tcMar>
+              <w:top w:type="dxa" w:w="80"/>
+              <w:left w:type="dxa" w:w="120"/>
+              <w:bottom w:type="dxa" w:w="80"/>
+              <w:right w:type="dxa" w:w="120"/>
+            </w:tcMar>
+          </w:tcPr>
+          <w:p>
+            <w:r>
+              <w:rPr>
+                <w:sz w:val="20"/>
+                <w:szCs w:val="20"/>
+              </w:rPr>
+              <w:t xml:space="preserve">Lucas</w:t>
+            </w:r>
+          </w:p>
+        </w:tc>
+        <w:tc>
+          <w:tcPr>
+            <w:tcW w:type="dxa" w:w="2422"/>
+            <w:tcBorders>
+              <w:top w:val="single" w:color="BFBFBF" w:sz="4"/>
+              <w:left w:val="single" w:color="BFBFBF" w:sz="4"/>
+              <w:bottom w:val="single" w:color="BFBFBF" w:sz="4"/>
+              <w:right w:val="single" w:color="BFBFBF" w:sz="4"/>
+            </w:tcBorders>
+            <w:tcMar>
+              <w:top w:type="dxa" w:w="80"/>
+              <w:left w:type="dxa" w:w="120"/>
+              <w:bottom w:type="dxa" w:w="80"/>
+              <w:right w:type="dxa" w:w="120"/>
+            </w:tcMar>
+          </w:tcPr>
+          <w:p>
+            <w:r>
+              <w:rPr>
+                <w:sz w:val="20"/>
+                <w:szCs w:val="20"/>
+              </w:rPr>
+              <w:t xml:space="preserve">12/11</w:t>
+            </w:r>
+          </w:p>
+        </w:tc>
+      </w:tr>
+      <w:tr>
+        <w:tc>
+          <w:tcPr>
+            <w:tcW w:type="dxa" w:w="1841"/>
+            <w:tcBorders>
+              <w:top w:val="single" w:color="BFBFBF" w:sz="4"/>
+              <w:left w:val="single" w:color="BFBFBF" w:sz="4"/>
+              <w:bottom w:val="single" w:color="BFBFBF" w:sz="4"/>
+              <w:right w:val="single" w:color="BFBFBF" w:sz="4"/>
+            </w:tcBorders>
+            <w:tcMar>
+              <w:top w:type="dxa" w:w="80"/>
+              <w:left w:type="dxa" w:w="120"/>
+              <w:bottom w:type="dxa" w:w="80"/>
+              <w:right w:type="dxa" w:w="120"/>
+            </w:tcMar>
+          </w:tcPr>
+          <w:p>
             <w:r>
               <w:rPr>
                 <w:b/>
@@ -10625,14 +10887,118 @@
                 <w:sz w:val="20"/>
                 <w:szCs w:val="20"/>
               </w:rPr>
-              <w:t xml:space="preserve">pruebas de resiliencia</w:t>
-            </w:r>
-            <w:r>
-              <w:rPr>
-                <w:sz w:val="20"/>
-                <w:szCs w:val="20"/>
-              </w:rPr>
-              <w:t xml:space="preserve">. Conviene definir qué combinación llega a los 8 puntos antes del 29/10.</w:t>
+              <w:t xml:space="preserve">Cobertura de pruebas</w:t>
+            </w:r>
+            <w:r>
+              <w:rPr>
+                <w:sz w:val="20"/>
+                <w:szCs w:val="20"/>
+              </w:rPr>
+              <w:t xml:space="preserve"> (7.2)</w:t>
+            </w:r>
+          </w:p>
+        </w:tc>
+        <w:tc>
+          <w:tcPr>
+            <w:tcW w:type="dxa" w:w="942"/>
+            <w:tcBorders>
+              <w:top w:val="single" w:color="BFBFBF" w:sz="4"/>
+              <w:left w:val="single" w:color="BFBFBF" w:sz="4"/>
+              <w:bottom w:val="single" w:color="BFBFBF" w:sz="4"/>
+              <w:right w:val="single" w:color="BFBFBF" w:sz="4"/>
+            </w:tcBorders>
+            <w:tcMar>
+              <w:top w:type="dxa" w:w="80"/>
+              <w:left w:type="dxa" w:w="120"/>
+              <w:bottom w:type="dxa" w:w="80"/>
+              <w:right w:type="dxa" w:w="120"/>
+            </w:tcMar>
+          </w:tcPr>
+          <w:p>
+            <w:r>
+              <w:rPr>
+                <w:sz w:val="20"/>
+                <w:szCs w:val="20"/>
+              </w:rPr>
+              <w:t xml:space="preserve">2</w:t>
+            </w:r>
+          </w:p>
+        </w:tc>
+        <w:tc>
+          <w:tcPr>
+            <w:tcW w:type="dxa" w:w="2998"/>
+            <w:tcBorders>
+              <w:top w:val="single" w:color="BFBFBF" w:sz="4"/>
+              <w:left w:val="single" w:color="BFBFBF" w:sz="4"/>
+              <w:bottom w:val="single" w:color="BFBFBF" w:sz="4"/>
+              <w:right w:val="single" w:color="BFBFBF" w:sz="4"/>
+            </w:tcBorders>
+            <w:tcMar>
+              <w:top w:type="dxa" w:w="80"/>
+              <w:left w:type="dxa" w:w="120"/>
+              <w:bottom w:type="dxa" w:w="80"/>
+              <w:right w:type="dxa" w:w="120"/>
+            </w:tcMar>
+          </w:tcPr>
+          <w:p>
+            <w:r>
+              <w:rPr>
+                <w:sz w:val="20"/>
+                <w:szCs w:val="20"/>
+              </w:rPr>
+              <w:t xml:space="preserve">Cobertura verificable superior al 70 % en las capas de dominio y aplicación, con reporte publicado por el pipeline.</w:t>
+            </w:r>
+          </w:p>
+        </w:tc>
+        <w:tc>
+          <w:tcPr>
+            <w:tcW w:type="dxa" w:w="1103"/>
+            <w:tcBorders>
+              <w:top w:val="single" w:color="BFBFBF" w:sz="4"/>
+              <w:left w:val="single" w:color="BFBFBF" w:sz="4"/>
+              <w:bottom w:val="single" w:color="BFBFBF" w:sz="4"/>
+              <w:right w:val="single" w:color="BFBFBF" w:sz="4"/>
+            </w:tcBorders>
+            <w:tcMar>
+              <w:top w:type="dxa" w:w="80"/>
+              <w:left w:type="dxa" w:w="120"/>
+              <w:bottom w:type="dxa" w:w="80"/>
+              <w:right w:type="dxa" w:w="120"/>
+            </w:tcMar>
+          </w:tcPr>
+          <w:p>
+            <w:r>
+              <w:rPr>
+                <w:sz w:val="20"/>
+                <w:szCs w:val="20"/>
+              </w:rPr>
+              <w:t xml:space="preserve">Ezequiel</w:t>
+            </w:r>
+          </w:p>
+        </w:tc>
+        <w:tc>
+          <w:tcPr>
+            <w:tcW w:type="dxa" w:w="2422"/>
+            <w:tcBorders>
+              <w:top w:val="single" w:color="BFBFBF" w:sz="4"/>
+              <w:left w:val="single" w:color="BFBFBF" w:sz="4"/>
+              <w:bottom w:val="single" w:color="BFBFBF" w:sz="4"/>
+              <w:right w:val="single" w:color="BFBFBF" w:sz="4"/>
+            </w:tcBorders>
+            <w:tcMar>
+              <w:top w:type="dxa" w:w="80"/>
+              <w:left w:type="dxa" w:w="120"/>
+              <w:bottom w:type="dxa" w:w="80"/>
+              <w:right w:type="dxa" w:w="120"/>
+            </w:tcMar>
+          </w:tcPr>
+          <w:p>
+            <w:r>
+              <w:rPr>
+                <w:sz w:val="20"/>
+                <w:szCs w:val="20"/>
+              </w:rPr>
+              <w:t xml:space="preserve">Reporte en el pipeline desde el 15/10; 70 % al 12/11</w:t>
             </w:r>
           </w:p>
         </w:tc>
@@ -10640,53 +11006,140 @@
       <w:tr>
         <w:tc>
           <w:tcPr>
-            <w:tcW w:type="dxa" w:w="2864"/>
-            <w:tcBorders>
-              <w:top w:val="single" w:color="BFBFBF" w:sz="4"/>
-              <w:left w:val="single" w:color="BFBFBF" w:sz="4"/>
-              <w:bottom w:val="single" w:color="BFBFBF" w:sz="4"/>
-              <w:right w:val="single" w:color="BFBFBF" w:sz="4"/>
-            </w:tcBorders>
-            <w:tcMar>
-              <w:top w:type="dxa" w:w="80"/>
-              <w:left w:type="dxa" w:w="120"/>
-              <w:bottom w:type="dxa" w:w="80"/>
-              <w:right w:type="dxa" w:w="120"/>
-            </w:tcMar>
-          </w:tcPr>
-          <w:p>
-            <w:r>
-              <w:rPr>
-                <w:sz w:val="20"/>
-                <w:szCs w:val="20"/>
-              </w:rPr>
-              <w:t xml:space="preserve">Hito del 22/10</w:t>
-            </w:r>
-          </w:p>
-        </w:tc>
-        <w:tc>
-          <w:tcPr>
-            <w:tcW w:type="dxa" w:w="6442"/>
-            <w:tcBorders>
-              <w:top w:val="single" w:color="BFBFBF" w:sz="4"/>
-              <w:left w:val="single" w:color="BFBFBF" w:sz="4"/>
-              <w:bottom w:val="single" w:color="BFBFBF" w:sz="4"/>
-              <w:right w:val="single" w:color="BFBFBF" w:sz="4"/>
-            </w:tcBorders>
-            <w:tcMar>
-              <w:top w:type="dxa" w:w="80"/>
-              <w:left w:type="dxa" w:w="120"/>
-              <w:bottom w:type="dxa" w:w="80"/>
-              <w:right w:type="dxa" w:w="120"/>
-            </w:tcMar>
-          </w:tcPr>
-          <w:p>
-            <w:r>
-              <w:rPr>
-                <w:sz w:val="20"/>
-                <w:szCs w:val="20"/>
-              </w:rPr>
-              <w:t xml:space="preserve">Es el más cargado (12 casos, 8 completos). Si el 15/10 se atrasa, conviene pasar CU-04 y CU-54 al 29/10.</w:t>
+            <w:tcW w:type="dxa" w:w="1841"/>
+            <w:tcBorders>
+              <w:top w:val="single" w:color="BFBFBF" w:sz="4"/>
+              <w:left w:val="single" w:color="BFBFBF" w:sz="4"/>
+              <w:bottom w:val="single" w:color="BFBFBF" w:sz="4"/>
+              <w:right w:val="single" w:color="BFBFBF" w:sz="4"/>
+            </w:tcBorders>
+            <w:tcMar>
+              <w:top w:type="dxa" w:w="80"/>
+              <w:left w:type="dxa" w:w="120"/>
+              <w:bottom w:type="dxa" w:w="80"/>
+              <w:right w:type="dxa" w:w="120"/>
+            </w:tcMar>
+          </w:tcPr>
+          <w:p>
+            <w:r>
+              <w:rPr>
+                <w:b/>
+                <w:bCs/>
+                <w:sz w:val="20"/>
+                <w:szCs w:val="20"/>
+              </w:rPr>
+              <w:t xml:space="preserve">Pruebas de resiliencia</w:t>
+            </w:r>
+            <w:r>
+              <w:rPr>
+                <w:sz w:val="20"/>
+                <w:szCs w:val="20"/>
+              </w:rPr>
+              <w:t xml:space="preserve"> (7.4)</w:t>
+            </w:r>
+          </w:p>
+        </w:tc>
+        <w:tc>
+          <w:tcPr>
+            <w:tcW w:type="dxa" w:w="942"/>
+            <w:tcBorders>
+              <w:top w:val="single" w:color="BFBFBF" w:sz="4"/>
+              <w:left w:val="single" w:color="BFBFBF" w:sz="4"/>
+              <w:bottom w:val="single" w:color="BFBFBF" w:sz="4"/>
+              <w:right w:val="single" w:color="BFBFBF" w:sz="4"/>
+            </w:tcBorders>
+            <w:tcMar>
+              <w:top w:type="dxa" w:w="80"/>
+              <w:left w:type="dxa" w:w="120"/>
+              <w:bottom w:type="dxa" w:w="80"/>
+              <w:right w:type="dxa" w:w="120"/>
+            </w:tcMar>
+          </w:tcPr>
+          <w:p>
+            <w:r>
+              <w:rPr>
+                <w:sz w:val="20"/>
+                <w:szCs w:val="20"/>
+              </w:rPr>
+              <w:t xml:space="preserve">2</w:t>
+            </w:r>
+          </w:p>
+        </w:tc>
+        <w:tc>
+          <w:tcPr>
+            <w:tcW w:type="dxa" w:w="2998"/>
+            <w:tcBorders>
+              <w:top w:val="single" w:color="BFBFBF" w:sz="4"/>
+              <w:left w:val="single" w:color="BFBFBF" w:sz="4"/>
+              <w:bottom w:val="single" w:color="BFBFBF" w:sz="4"/>
+              <w:right w:val="single" w:color="BFBFBF" w:sz="4"/>
+            </w:tcBorders>
+            <w:tcMar>
+              <w:top w:type="dxa" w:w="80"/>
+              <w:left w:type="dxa" w:w="120"/>
+              <w:bottom w:type="dxa" w:w="80"/>
+              <w:right w:type="dxa" w:w="120"/>
+            </w:tcMar>
+          </w:tcPr>
+          <w:p>
+            <w:r>
+              <w:rPr>
+                <w:sz w:val="20"/>
+                <w:szCs w:val="20"/>
+              </w:rPr>
+              <w:t xml:space="preserve">Interrumpir deliberadamente dependencias (caché, cola, base de datos y un servicio externo) y documentar el comportamiento degradado esperado y el observado.</w:t>
+            </w:r>
+          </w:p>
+        </w:tc>
+        <w:tc>
+          <w:tcPr>
+            <w:tcW w:type="dxa" w:w="1103"/>
+            <w:tcBorders>
+              <w:top w:val="single" w:color="BFBFBF" w:sz="4"/>
+              <w:left w:val="single" w:color="BFBFBF" w:sz="4"/>
+              <w:bottom w:val="single" w:color="BFBFBF" w:sz="4"/>
+              <w:right w:val="single" w:color="BFBFBF" w:sz="4"/>
+            </w:tcBorders>
+            <w:tcMar>
+              <w:top w:type="dxa" w:w="80"/>
+              <w:left w:type="dxa" w:w="120"/>
+              <w:bottom w:type="dxa" w:w="80"/>
+              <w:right w:type="dxa" w:w="120"/>
+            </w:tcMar>
+          </w:tcPr>
+          <w:p>
+            <w:r>
+              <w:rPr>
+                <w:sz w:val="20"/>
+                <w:szCs w:val="20"/>
+              </w:rPr>
+              <w:t xml:space="preserve">Ezequiel</w:t>
+            </w:r>
+          </w:p>
+        </w:tc>
+        <w:tc>
+          <w:tcPr>
+            <w:tcW w:type="dxa" w:w="2422"/>
+            <w:tcBorders>
+              <w:top w:val="single" w:color="BFBFBF" w:sz="4"/>
+              <w:left w:val="single" w:color="BFBFBF" w:sz="4"/>
+              <w:bottom w:val="single" w:color="BFBFBF" w:sz="4"/>
+              <w:right w:val="single" w:color="BFBFBF" w:sz="4"/>
+            </w:tcBorders>
+            <w:tcMar>
+              <w:top w:type="dxa" w:w="80"/>
+              <w:left w:type="dxa" w:w="120"/>
+              <w:bottom w:type="dxa" w:w="80"/>
+              <w:right w:type="dxa" w:w="120"/>
+            </w:tcMar>
+          </w:tcPr>
+          <w:p>
+            <w:r>
+              <w:rPr>
+                <w:sz w:val="20"/>
+                <w:szCs w:val="20"/>
+              </w:rPr>
+              <w:t xml:space="preserve">12/11</w:t>
             </w:r>
           </w:p>
         </w:tc>
@@ -10694,7 +11147,437 @@
       <w:tr>
         <w:tc>
           <w:tcPr>
-            <w:tcW w:type="dxa" w:w="2864"/>
+            <w:tcW w:type="dxa" w:w="1841"/>
+            <w:tcBorders>
+              <w:top w:val="single" w:color="BFBFBF" w:sz="4"/>
+              <w:left w:val="single" w:color="BFBFBF" w:sz="4"/>
+              <w:bottom w:val="single" w:color="BFBFBF" w:sz="4"/>
+              <w:right w:val="single" w:color="BFBFBF" w:sz="4"/>
+            </w:tcBorders>
+            <w:tcMar>
+              <w:top w:type="dxa" w:w="80"/>
+              <w:left w:type="dxa" w:w="120"/>
+              <w:bottom w:type="dxa" w:w="80"/>
+              <w:right w:type="dxa" w:w="120"/>
+            </w:tcMar>
+          </w:tcPr>
+          <w:p>
+            <w:r>
+              <w:rPr>
+                <w:b/>
+                <w:bCs/>
+                <w:sz w:val="20"/>
+                <w:szCs w:val="20"/>
+              </w:rPr>
+              <w:t xml:space="preserve">Pruebas de extremo a extremo</w:t>
+            </w:r>
+            <w:r>
+              <w:rPr>
+                <w:sz w:val="20"/>
+                <w:szCs w:val="20"/>
+              </w:rPr>
+              <w:t xml:space="preserve"> (7.2)</w:t>
+            </w:r>
+          </w:p>
+        </w:tc>
+        <w:tc>
+          <w:tcPr>
+            <w:tcW w:type="dxa" w:w="942"/>
+            <w:tcBorders>
+              <w:top w:val="single" w:color="BFBFBF" w:sz="4"/>
+              <w:left w:val="single" w:color="BFBFBF" w:sz="4"/>
+              <w:bottom w:val="single" w:color="BFBFBF" w:sz="4"/>
+              <w:right w:val="single" w:color="BFBFBF" w:sz="4"/>
+            </w:tcBorders>
+            <w:tcMar>
+              <w:top w:type="dxa" w:w="80"/>
+              <w:left w:type="dxa" w:w="120"/>
+              <w:bottom w:type="dxa" w:w="80"/>
+              <w:right w:type="dxa" w:w="120"/>
+            </w:tcMar>
+          </w:tcPr>
+          <w:p>
+            <w:r>
+              <w:rPr>
+                <w:sz w:val="20"/>
+                <w:szCs w:val="20"/>
+              </w:rPr>
+              <w:t xml:space="preserve">2</w:t>
+            </w:r>
+          </w:p>
+        </w:tc>
+        <w:tc>
+          <w:tcPr>
+            <w:tcW w:type="dxa" w:w="2998"/>
+            <w:tcBorders>
+              <w:top w:val="single" w:color="BFBFBF" w:sz="4"/>
+              <w:left w:val="single" w:color="BFBFBF" w:sz="4"/>
+              <w:bottom w:val="single" w:color="BFBFBF" w:sz="4"/>
+              <w:right w:val="single" w:color="BFBFBF" w:sz="4"/>
+            </w:tcBorders>
+            <w:tcMar>
+              <w:top w:type="dxa" w:w="80"/>
+              <w:left w:type="dxa" w:w="120"/>
+              <w:bottom w:type="dxa" w:w="80"/>
+              <w:right w:type="dxa" w:w="120"/>
+            </w:tcMar>
+          </w:tcPr>
+          <w:p>
+            <w:r>
+              <w:rPr>
+                <w:sz w:val="20"/>
+                <w:szCs w:val="20"/>
+              </w:rPr>
+              <w:t xml:space="preserve">Playwright o equivalente sobre los flujos críticos, integradas al pipeline.</w:t>
+            </w:r>
+          </w:p>
+        </w:tc>
+        <w:tc>
+          <w:tcPr>
+            <w:tcW w:type="dxa" w:w="1103"/>
+            <w:tcBorders>
+              <w:top w:val="single" w:color="BFBFBF" w:sz="4"/>
+              <w:left w:val="single" w:color="BFBFBF" w:sz="4"/>
+              <w:bottom w:val="single" w:color="BFBFBF" w:sz="4"/>
+              <w:right w:val="single" w:color="BFBFBF" w:sz="4"/>
+            </w:tcBorders>
+            <w:tcMar>
+              <w:top w:type="dxa" w:w="80"/>
+              <w:left w:type="dxa" w:w="120"/>
+              <w:bottom w:type="dxa" w:w="80"/>
+              <w:right w:type="dxa" w:w="120"/>
+            </w:tcMar>
+          </w:tcPr>
+          <w:p>
+            <w:r>
+              <w:rPr>
+                <w:sz w:val="20"/>
+                <w:szCs w:val="20"/>
+              </w:rPr>
+              <w:t xml:space="preserve">Cristian</w:t>
+            </w:r>
+          </w:p>
+        </w:tc>
+        <w:tc>
+          <w:tcPr>
+            <w:tcW w:type="dxa" w:w="2422"/>
+            <w:tcBorders>
+              <w:top w:val="single" w:color="BFBFBF" w:sz="4"/>
+              <w:left w:val="single" w:color="BFBFBF" w:sz="4"/>
+              <w:bottom w:val="single" w:color="BFBFBF" w:sz="4"/>
+              <w:right w:val="single" w:color="BFBFBF" w:sz="4"/>
+            </w:tcBorders>
+            <w:tcMar>
+              <w:top w:type="dxa" w:w="80"/>
+              <w:left w:type="dxa" w:w="120"/>
+              <w:bottom w:type="dxa" w:w="80"/>
+              <w:right w:type="dxa" w:w="120"/>
+            </w:tcMar>
+          </w:tcPr>
+          <w:p>
+            <w:r>
+              <w:rPr>
+                <w:sz w:val="20"/>
+                <w:szCs w:val="20"/>
+              </w:rPr>
+              <w:t xml:space="preserve">12/11</w:t>
+            </w:r>
+          </w:p>
+        </w:tc>
+      </w:tr>
+      <w:tr>
+        <w:tc>
+          <w:tcPr>
+            <w:tcW w:type="dxa" w:w="1841"/>
+            <w:tcBorders>
+              <w:top w:val="single" w:color="BFBFBF" w:sz="4"/>
+              <w:left w:val="single" w:color="BFBFBF" w:sz="4"/>
+              <w:bottom w:val="single" w:color="BFBFBF" w:sz="4"/>
+              <w:right w:val="single" w:color="BFBFBF" w:sz="4"/>
+            </w:tcBorders>
+            <w:tcMar>
+              <w:top w:type="dxa" w:w="80"/>
+              <w:left w:type="dxa" w:w="120"/>
+              <w:bottom w:type="dxa" w:w="80"/>
+              <w:right w:type="dxa" w:w="120"/>
+            </w:tcMar>
+          </w:tcPr>
+          <w:p>
+            <w:r>
+              <w:rPr>
+                <w:b/>
+                <w:bCs/>
+                <w:sz w:val="20"/>
+                <w:szCs w:val="20"/>
+              </w:rPr>
+              <w:t xml:space="preserve">Total</w:t>
+            </w:r>
+          </w:p>
+        </w:tc>
+        <w:tc>
+          <w:tcPr>
+            <w:tcW w:type="dxa" w:w="942"/>
+            <w:tcBorders>
+              <w:top w:val="single" w:color="BFBFBF" w:sz="4"/>
+              <w:left w:val="single" w:color="BFBFBF" w:sz="4"/>
+              <w:bottom w:val="single" w:color="BFBFBF" w:sz="4"/>
+              <w:right w:val="single" w:color="BFBFBF" w:sz="4"/>
+            </w:tcBorders>
+            <w:tcMar>
+              <w:top w:type="dxa" w:w="80"/>
+              <w:left w:type="dxa" w:w="120"/>
+              <w:bottom w:type="dxa" w:w="80"/>
+              <w:right w:type="dxa" w:w="120"/>
+            </w:tcMar>
+          </w:tcPr>
+          <w:p>
+            <w:r>
+              <w:rPr>
+                <w:b/>
+                <w:bCs/>
+                <w:sz w:val="20"/>
+                <w:szCs w:val="20"/>
+              </w:rPr>
+              <w:t xml:space="preserve">9</w:t>
+            </w:r>
+          </w:p>
+        </w:tc>
+        <w:tc>
+          <w:tcPr>
+            <w:tcW w:type="dxa" w:w="2998"/>
+            <w:tcBorders>
+              <w:top w:val="single" w:color="BFBFBF" w:sz="4"/>
+              <w:left w:val="single" w:color="BFBFBF" w:sz="4"/>
+              <w:bottom w:val="single" w:color="BFBFBF" w:sz="4"/>
+              <w:right w:val="single" w:color="BFBFBF" w:sz="4"/>
+            </w:tcBorders>
+            <w:tcMar>
+              <w:top w:type="dxa" w:w="80"/>
+              <w:left w:type="dxa" w:w="120"/>
+              <w:bottom w:type="dxa" w:w="80"/>
+              <w:right w:type="dxa" w:w="120"/>
+            </w:tcMar>
+          </w:tcPr>
+          <w:p/>
+        </w:tc>
+        <w:tc>
+          <w:tcPr>
+            <w:tcW w:type="dxa" w:w="1103"/>
+            <w:tcBorders>
+              <w:top w:val="single" w:color="BFBFBF" w:sz="4"/>
+              <w:left w:val="single" w:color="BFBFBF" w:sz="4"/>
+              <w:bottom w:val="single" w:color="BFBFBF" w:sz="4"/>
+              <w:right w:val="single" w:color="BFBFBF" w:sz="4"/>
+            </w:tcBorders>
+            <w:tcMar>
+              <w:top w:type="dxa" w:w="80"/>
+              <w:left w:type="dxa" w:w="120"/>
+              <w:bottom w:type="dxa" w:w="80"/>
+              <w:right w:type="dxa" w:w="120"/>
+            </w:tcMar>
+          </w:tcPr>
+          <w:p/>
+        </w:tc>
+        <w:tc>
+          <w:tcPr>
+            <w:tcW w:type="dxa" w:w="2422"/>
+            <w:tcBorders>
+              <w:top w:val="single" w:color="BFBFBF" w:sz="4"/>
+              <w:left w:val="single" w:color="BFBFBF" w:sz="4"/>
+              <w:bottom w:val="single" w:color="BFBFBF" w:sz="4"/>
+              <w:right w:val="single" w:color="BFBFBF" w:sz="4"/>
+            </w:tcBorders>
+            <w:tcMar>
+              <w:top w:type="dxa" w:w="80"/>
+              <w:left w:type="dxa" w:w="120"/>
+              <w:bottom w:type="dxa" w:w="80"/>
+              <w:right w:type="dxa" w:w="120"/>
+            </w:tcMar>
+          </w:tcPr>
+          <w:p/>
+        </w:tc>
+      </w:tr>
+    </w:tbl>
+    <w:p>
+      <w:pPr>
+        <w:spacing w:after="120"/>
+      </w:pPr>
+    </w:p>
+    <w:p>
+      <w:pPr>
+        <w:spacing w:after="140" w:line="276"/>
+      </w:pPr>
+      <w:r>
+        <w:rPr>
+          <w:b/>
+          <w:bCs/>
+        </w:rPr>
+        <w:t xml:space="preserve">Sin margen:</w:t>
+      </w:r>
+      <w:r>
+        <w:t xml:space="preserve"> si cualquiera de los cuatro no cumple todas sus condiciones, el total baja a 7 o menos y no se alcanza el mínimo, que es condición de aprobación (sección 9.6). Cada opcional se da por terminado sólo cuando se verifica su lista de condiciones completa.</w:t>
+      </w:r>
+    </w:p>
+    <w:p>
+      <w:pPr>
+        <w:spacing w:after="140" w:line="276"/>
+      </w:pPr>
+      <w:r>
+        <w:rPr>
+          <w:b/>
+          <w:bCs/>
+        </w:rPr>
+        <w:t xml:space="preserve">Por qué esta combinación:</w:t>
+      </w:r>
+      <w:r>
+        <w:t xml:space="preserve"> la cobertura y la resiliencia aprovechan lo que ya existe (pruebas en el pipeline, Docker Compose con todas las dependencias); las pruebas de extremo a extremo con Playwright ya se usaron para verificar la PWA. Las banderas de funcionalidad (7.4, 2 puntos) quedan como reemplazo si alguno de los anteriores se complica.</w:t>
+      </w:r>
+    </w:p>
+    <w:p>
+      <w:pPr>
+        <w:pStyle w:val="Heading1"/>
+      </w:pPr>
+      <w:r>
+        <w:t xml:space="preserve">5. Decisiones abiertas del plan</w:t>
+      </w:r>
+    </w:p>
+    <w:tbl>
+      <w:tblPr>
+        <w:tblW w:type="dxa" w:w="9306"/>
+        <w:tblBorders>
+          <w:top w:val="single" w:color="auto" w:sz="4"/>
+          <w:left w:val="single" w:color="auto" w:sz="4"/>
+          <w:bottom w:val="single" w:color="auto" w:sz="4"/>
+          <w:right w:val="single" w:color="auto" w:sz="4"/>
+          <w:insideH w:val="single" w:color="auto" w:sz="4"/>
+          <w:insideV w:val="single" w:color="auto" w:sz="4"/>
+        </w:tblBorders>
+      </w:tblPr>
+      <w:tblGrid>
+        <w:gridCol w:w="2051"/>
+        <w:gridCol w:w="7255"/>
+      </w:tblGrid>
+      <w:tr>
+        <w:trPr>
+          <w:tblHeader/>
+        </w:trPr>
+        <w:tc>
+          <w:tcPr>
+            <w:tcW w:type="dxa" w:w="2051"/>
+            <w:tcBorders>
+              <w:top w:val="single" w:color="BFBFBF" w:sz="4"/>
+              <w:left w:val="single" w:color="BFBFBF" w:sz="4"/>
+              <w:bottom w:val="single" w:color="BFBFBF" w:sz="4"/>
+              <w:right w:val="single" w:color="BFBFBF" w:sz="4"/>
+            </w:tcBorders>
+            <w:shd w:fill="D9E2F3" w:color="auto" w:val="clear"/>
+            <w:tcMar>
+              <w:top w:type="dxa" w:w="80"/>
+              <w:left w:type="dxa" w:w="120"/>
+              <w:bottom w:type="dxa" w:w="80"/>
+              <w:right w:type="dxa" w:w="120"/>
+            </w:tcMar>
+          </w:tcPr>
+          <w:p>
+            <w:r>
+              <w:rPr>
+                <w:b/>
+                <w:bCs/>
+                <w:sz w:val="20"/>
+                <w:szCs w:val="20"/>
+              </w:rPr>
+              <w:t xml:space="preserve">Tema</w:t>
+            </w:r>
+          </w:p>
+        </w:tc>
+        <w:tc>
+          <w:tcPr>
+            <w:tcW w:type="dxa" w:w="7255"/>
+            <w:tcBorders>
+              <w:top w:val="single" w:color="BFBFBF" w:sz="4"/>
+              <w:left w:val="single" w:color="BFBFBF" w:sz="4"/>
+              <w:bottom w:val="single" w:color="BFBFBF" w:sz="4"/>
+              <w:right w:val="single" w:color="BFBFBF" w:sz="4"/>
+            </w:tcBorders>
+            <w:shd w:fill="D9E2F3" w:color="auto" w:val="clear"/>
+            <w:tcMar>
+              <w:top w:type="dxa" w:w="80"/>
+              <w:left w:type="dxa" w:w="120"/>
+              <w:bottom w:type="dxa" w:w="80"/>
+              <w:right w:type="dxa" w:w="120"/>
+            </w:tcMar>
+          </w:tcPr>
+          <w:p>
+            <w:r>
+              <w:rPr>
+                <w:b/>
+                <w:bCs/>
+                <w:sz w:val="20"/>
+                <w:szCs w:val="20"/>
+              </w:rPr>
+              <w:t xml:space="preserve">Por qué importa</w:t>
+            </w:r>
+          </w:p>
+        </w:tc>
+      </w:tr>
+      <w:tr>
+        <w:tc>
+          <w:tcPr>
+            <w:tcW w:type="dxa" w:w="2051"/>
+            <w:tcBorders>
+              <w:top w:val="single" w:color="BFBFBF" w:sz="4"/>
+              <w:left w:val="single" w:color="BFBFBF" w:sz="4"/>
+              <w:bottom w:val="single" w:color="BFBFBF" w:sz="4"/>
+              <w:right w:val="single" w:color="BFBFBF" w:sz="4"/>
+            </w:tcBorders>
+            <w:tcMar>
+              <w:top w:type="dxa" w:w="80"/>
+              <w:left w:type="dxa" w:w="120"/>
+              <w:bottom w:type="dxa" w:w="80"/>
+              <w:right w:type="dxa" w:w="120"/>
+            </w:tcMar>
+          </w:tcPr>
+          <w:p>
+            <w:r>
+              <w:rPr>
+                <w:sz w:val="20"/>
+                <w:szCs w:val="20"/>
+              </w:rPr>
+              <w:t xml:space="preserve">Hito del 22/10</w:t>
+            </w:r>
+          </w:p>
+        </w:tc>
+        <w:tc>
+          <w:tcPr>
+            <w:tcW w:type="dxa" w:w="7255"/>
+            <w:tcBorders>
+              <w:top w:val="single" w:color="BFBFBF" w:sz="4"/>
+              <w:left w:val="single" w:color="BFBFBF" w:sz="4"/>
+              <w:bottom w:val="single" w:color="BFBFBF" w:sz="4"/>
+              <w:right w:val="single" w:color="BFBFBF" w:sz="4"/>
+            </w:tcBorders>
+            <w:tcMar>
+              <w:top w:type="dxa" w:w="80"/>
+              <w:left w:type="dxa" w:w="120"/>
+              <w:bottom w:type="dxa" w:w="80"/>
+              <w:right w:type="dxa" w:w="120"/>
+            </w:tcMar>
+          </w:tcPr>
+          <w:p>
+            <w:r>
+              <w:rPr>
+                <w:sz w:val="20"/>
+                <w:szCs w:val="20"/>
+              </w:rPr>
+              <w:t xml:space="preserve">Es el más cargado (12 casos, 8 completos). Si el 15/10 se atrasa, conviene pasar CU-04 y CU-54 al 29/10.</w:t>
+            </w:r>
+          </w:p>
+        </w:tc>
+      </w:tr>
+      <w:tr>
+        <w:tc>
+          <w:tcPr>
+            <w:tcW w:type="dxa" w:w="2051"/>
             <w:tcBorders>
               <w:top w:val="single" w:color="BFBFBF" w:sz="4"/>
               <w:left w:val="single" w:color="BFBFBF" w:sz="4"/>
@@ -10720,7 +11603,7 @@
         </w:tc>
         <w:tc>
           <w:tcPr>
-            <w:tcW w:type="dxa" w:w="6442"/>
+            <w:tcW w:type="dxa" w:w="7255"/>
             <w:tcBorders>
               <w:top w:val="single" w:color="BFBFBF" w:sz="4"/>
               <w:left w:val="single" w:color="BFBFBF" w:sz="4"/>
@@ -10756,7 +11639,7 @@
         <w:pStyle w:val="Heading1"/>
       </w:pPr>
       <w:r>
-        <w:t xml:space="preserve">5. Historial de versiones</w:t>
+        <w:t xml:space="preserve">6. Historial de versiones</w:t>
       </w:r>
     </w:p>
     <w:tbl>
@@ -11080,6 +11963,218 @@
                 <w:szCs w:val="20"/>
               </w:rPr>
               <w:t xml:space="preserve">Responsable = dueño que responde por el caso, no único que lo programa. Reparto equilibrado por bloques (16, 16 y 17 casos), acordado con Lucas Ottonello.</w:t>
+            </w:r>
+          </w:p>
+        </w:tc>
+        <w:tc>
+          <w:tcPr>
+            <w:tcW w:type="dxa" w:w="1782"/>
+            <w:tcBorders>
+              <w:top w:val="single" w:color="BFBFBF" w:sz="4"/>
+              <w:left w:val="single" w:color="BFBFBF" w:sz="4"/>
+              <w:bottom w:val="single" w:color="BFBFBF" w:sz="4"/>
+              <w:right w:val="single" w:color="BFBFBF" w:sz="4"/>
+            </w:tcBorders>
+            <w:tcMar>
+              <w:top w:type="dxa" w:w="80"/>
+              <w:left w:type="dxa" w:w="120"/>
+              <w:bottom w:type="dxa" w:w="80"/>
+              <w:right w:type="dxa" w:w="120"/>
+            </w:tcMar>
+          </w:tcPr>
+          <w:p>
+            <w:r>
+              <w:rPr>
+                <w:sz w:val="20"/>
+                <w:szCs w:val="20"/>
+              </w:rPr>
+              <w:t xml:space="preserve">Ezequiel Marcenal</w:t>
+            </w:r>
+          </w:p>
+        </w:tc>
+      </w:tr>
+      <w:tr>
+        <w:tc>
+          <w:tcPr>
+            <w:tcW w:type="dxa" w:w="1174"/>
+            <w:tcBorders>
+              <w:top w:val="single" w:color="BFBFBF" w:sz="4"/>
+              <w:left w:val="single" w:color="BFBFBF" w:sz="4"/>
+              <w:bottom w:val="single" w:color="BFBFBF" w:sz="4"/>
+              <w:right w:val="single" w:color="BFBFBF" w:sz="4"/>
+            </w:tcBorders>
+            <w:tcMar>
+              <w:top w:type="dxa" w:w="80"/>
+              <w:left w:type="dxa" w:w="120"/>
+              <w:bottom w:type="dxa" w:w="80"/>
+              <w:right w:type="dxa" w:w="120"/>
+            </w:tcMar>
+          </w:tcPr>
+          <w:p>
+            <w:r>
+              <w:rPr>
+                <w:sz w:val="20"/>
+                <w:szCs w:val="20"/>
+              </w:rPr>
+              <w:t xml:space="preserve">0.3</w:t>
+            </w:r>
+          </w:p>
+        </w:tc>
+        <w:tc>
+          <w:tcPr>
+            <w:tcW w:type="dxa" w:w="1356"/>
+            <w:tcBorders>
+              <w:top w:val="single" w:color="BFBFBF" w:sz="4"/>
+              <w:left w:val="single" w:color="BFBFBF" w:sz="4"/>
+              <w:bottom w:val="single" w:color="BFBFBF" w:sz="4"/>
+              <w:right w:val="single" w:color="BFBFBF" w:sz="4"/>
+            </w:tcBorders>
+            <w:tcMar>
+              <w:top w:type="dxa" w:w="80"/>
+              <w:left w:type="dxa" w:w="120"/>
+              <w:bottom w:type="dxa" w:w="80"/>
+              <w:right w:type="dxa" w:w="120"/>
+            </w:tcMar>
+          </w:tcPr>
+          <w:p>
+            <w:r>
+              <w:rPr>
+                <w:sz w:val="20"/>
+                <w:szCs w:val="20"/>
+              </w:rPr>
+              <w:t xml:space="preserve">02/10/2026</w:t>
+            </w:r>
+          </w:p>
+        </w:tc>
+        <w:tc>
+          <w:tcPr>
+            <w:tcW w:type="dxa" w:w="4994"/>
+            <w:tcBorders>
+              <w:top w:val="single" w:color="BFBFBF" w:sz="4"/>
+              <w:left w:val="single" w:color="BFBFBF" w:sz="4"/>
+              <w:bottom w:val="single" w:color="BFBFBF" w:sz="4"/>
+              <w:right w:val="single" w:color="BFBFBF" w:sz="4"/>
+            </w:tcBorders>
+            <w:tcMar>
+              <w:top w:type="dxa" w:w="80"/>
+              <w:left w:type="dxa" w:w="120"/>
+              <w:bottom w:type="dxa" w:w="80"/>
+              <w:right w:type="dxa" w:w="120"/>
+            </w:tcMar>
+          </w:tcPr>
+          <w:p>
+            <w:r>
+              <w:rPr>
+                <w:sz w:val="20"/>
+                <w:szCs w:val="20"/>
+              </w:rPr>
+              <w:t xml:space="preserve">Reglas de los niveles (condiciones de los RF y opcionales completos o nada). API pública pasa a nivel Completo. Nueva sección 4 con los opcionales elegidos (9 puntos).</w:t>
+            </w:r>
+          </w:p>
+        </w:tc>
+        <w:tc>
+          <w:tcPr>
+            <w:tcW w:type="dxa" w:w="1782"/>
+            <w:tcBorders>
+              <w:top w:val="single" w:color="BFBFBF" w:sz="4"/>
+              <w:left w:val="single" w:color="BFBFBF" w:sz="4"/>
+              <w:bottom w:val="single" w:color="BFBFBF" w:sz="4"/>
+              <w:right w:val="single" w:color="BFBFBF" w:sz="4"/>
+            </w:tcBorders>
+            <w:tcMar>
+              <w:top w:type="dxa" w:w="80"/>
+              <w:left w:type="dxa" w:w="120"/>
+              <w:bottom w:type="dxa" w:w="80"/>
+              <w:right w:type="dxa" w:w="120"/>
+            </w:tcMar>
+          </w:tcPr>
+          <w:p>
+            <w:r>
+              <w:rPr>
+                <w:sz w:val="20"/>
+                <w:szCs w:val="20"/>
+              </w:rPr>
+              <w:t xml:space="preserve">Ezequiel Marcenal</w:t>
+            </w:r>
+          </w:p>
+        </w:tc>
+      </w:tr>
+      <w:tr>
+        <w:tc>
+          <w:tcPr>
+            <w:tcW w:type="dxa" w:w="1174"/>
+            <w:tcBorders>
+              <w:top w:val="single" w:color="BFBFBF" w:sz="4"/>
+              <w:left w:val="single" w:color="BFBFBF" w:sz="4"/>
+              <w:bottom w:val="single" w:color="BFBFBF" w:sz="4"/>
+              <w:right w:val="single" w:color="BFBFBF" w:sz="4"/>
+            </w:tcBorders>
+            <w:tcMar>
+              <w:top w:type="dxa" w:w="80"/>
+              <w:left w:type="dxa" w:w="120"/>
+              <w:bottom w:type="dxa" w:w="80"/>
+              <w:right w:type="dxa" w:w="120"/>
+            </w:tcMar>
+          </w:tcPr>
+          <w:p>
+            <w:r>
+              <w:rPr>
+                <w:sz w:val="20"/>
+                <w:szCs w:val="20"/>
+              </w:rPr>
+              <w:t xml:space="preserve">0.4</w:t>
+            </w:r>
+          </w:p>
+        </w:tc>
+        <w:tc>
+          <w:tcPr>
+            <w:tcW w:type="dxa" w:w="1356"/>
+            <w:tcBorders>
+              <w:top w:val="single" w:color="BFBFBF" w:sz="4"/>
+              <w:left w:val="single" w:color="BFBFBF" w:sz="4"/>
+              <w:bottom w:val="single" w:color="BFBFBF" w:sz="4"/>
+              <w:right w:val="single" w:color="BFBFBF" w:sz="4"/>
+            </w:tcBorders>
+            <w:tcMar>
+              <w:top w:type="dxa" w:w="80"/>
+              <w:left w:type="dxa" w:w="120"/>
+              <w:bottom w:type="dxa" w:w="80"/>
+              <w:right w:type="dxa" w:w="120"/>
+            </w:tcMar>
+          </w:tcPr>
+          <w:p>
+            <w:r>
+              <w:rPr>
+                <w:sz w:val="20"/>
+                <w:szCs w:val="20"/>
+              </w:rPr>
+              <w:t xml:space="preserve">02/10/2026</w:t>
+            </w:r>
+          </w:p>
+        </w:tc>
+        <w:tc>
+          <w:tcPr>
+            <w:tcW w:type="dxa" w:w="4994"/>
+            <w:tcBorders>
+              <w:top w:val="single" w:color="BFBFBF" w:sz="4"/>
+              <w:left w:val="single" w:color="BFBFBF" w:sz="4"/>
+              <w:bottom w:val="single" w:color="BFBFBF" w:sz="4"/>
+              <w:right w:val="single" w:color="BFBFBF" w:sz="4"/>
+            </w:tcBorders>
+            <w:tcMar>
+              <w:top w:type="dxa" w:w="80"/>
+              <w:left w:type="dxa" w:w="120"/>
+              <w:bottom w:type="dxa" w:w="80"/>
+              <w:right w:type="dxa" w:w="120"/>
+            </w:tcMar>
+          </w:tcPr>
+          <w:p>
+            <w:r>
+              <w:rPr>
+                <w:sz w:val="20"/>
+                <w:szCs w:val="20"/>
+              </w:rPr>
+              <w:t xml:space="preserve">CU-61: T18 y T19 confirmadas.</w:t>
             </w:r>
           </w:p>
         </w:tc>
@@ -11366,6 +12461,12 @@
     </w:lvlOverride>
   </w:num>
   <w:num w:numId="2">
+    <w:abstractNumId w:val="3"/>
+    <w:lvlOverride w:ilvl="0">
+      <w:startOverride w:val="1"/>
+    </w:lvlOverride>
+  </w:num>
+  <w:num w:numId="3">
     <w:abstractNumId w:val="3"/>
     <w:lvlOverride w:ilvl="0">
       <w:startOverride w:val="1"/>

</xml_diff>